<commit_message>
docs: clarify pc offline ultrasound terminal role
</commit_message>
<xml_diff>
--- a/docs/v5_benchmark/CardioConsult_PC_V5_EchoBench_Technical_Report_APA_20260604.docx
+++ b/docs/v5_benchmark/CardioConsult_PC_V5_EchoBench_Technical_Report_APA_20260604.docx
@@ -9,7 +9,7 @@
       </w:pPr>
       <w:r>
         <w:rPr>
-          <w:rFonts w:ascii="Calibri" w:hAnsi="Calibri" w:eastAsia="Microsoft YaHei"/>
+          <w:rFonts w:ascii="Microsoft YaHei" w:hAnsi="Microsoft YaHei" w:eastAsia="Microsoft YaHei"/>
           <w:b/>
           <w:color w:val="0B2545"/>
           <w:sz w:val="44"/>
@@ -23,7 +23,7 @@
       </w:pPr>
       <w:r>
         <w:rPr>
-          <w:rFonts w:ascii="Calibri" w:hAnsi="Calibri" w:eastAsia="Microsoft YaHei"/>
+          <w:rFonts w:ascii="Microsoft YaHei" w:hAnsi="Microsoft YaHei" w:eastAsia="Microsoft YaHei"/>
           <w:color w:val="555555"/>
           <w:sz w:val="22"/>
         </w:rPr>
@@ -66,7 +66,7 @@
             </w:pPr>
             <w:r>
               <w:rPr>
-                <w:rFonts w:ascii="Calibri" w:hAnsi="Calibri" w:eastAsia="Microsoft YaHei"/>
+                <w:rFonts w:ascii="Microsoft YaHei" w:hAnsi="Microsoft YaHei" w:eastAsia="Microsoft YaHei"/>
                 <w:b/>
                 <w:color w:val="1F4D78"/>
               </w:rPr>
@@ -79,10 +79,10 @@
             </w:pPr>
             <w:r>
               <w:rPr>
-                <w:rFonts w:ascii="Calibri" w:hAnsi="Calibri" w:eastAsia="Microsoft YaHei"/>
+                <w:rFonts w:ascii="Microsoft YaHei" w:hAnsi="Microsoft YaHei" w:eastAsia="Microsoft YaHei"/>
                 <w:sz w:val="20"/>
               </w:rPr>
-              <w:t>CardioConsult PC V5 面向心脏超声教学参考和基层辅助初筛场景，目标是在普通 PC 上离线读取 PNG、DICOM/DCOM 与超声动图文件，输出从大方向到最小病症的结构化疑似诊断文字。V5 在原有 B-mode、Color Doppler、层级标签规则和 Gemma4 4B GGUF 本地报告生成基础上，加入 EchoNet-Dynamic 动态 B-mode 校准层，用于增强 EF 和左室收缩功能减低识别。</w:t>
+              <w:t>CardioConsult PC V5 面向心脏超声教学参考和基层辅助初筛场景。这里的 PC 被定义为可直接接入超声机器或超声工作站的离线分析设备：它可以通过 USB、局域网共享目录、DICOM 工作站导出目录或无线超声软件导出文件读取 PNG、DICOM/DCOM 与超声动图，并在本机输出从大方向到最小病症的结构化疑似诊断文字。V5 在原有 B-mode、Color Doppler、层级标签规则和 Gemma4 4B GGUF 本地报告生成基础上，加入 EchoNet-Dynamic 动态 B-mode 校准层，用于增强 EF 和左室收缩功能减低识别。</w:t>
             </w:r>
           </w:p>
         </w:tc>
@@ -91,9 +91,53 @@
     <w:p/>
     <w:p>
       <w:pPr>
-        <w:pStyle w:val="Heading1"/>
+        <w:keepNext/>
+        <w:spacing w:before="320" w:after="160"/>
       </w:pPr>
       <w:r>
+        <w:rPr>
+          <w:rFonts w:ascii="Microsoft YaHei" w:hAnsi="Microsoft YaHei" w:eastAsia="Microsoft YaHei"/>
+          <w:b/>
+          <w:color w:val="2E74B5"/>
+          <w:sz w:val="32"/>
+        </w:rPr>
+        <w:t>PC 设备定位：超声机器旁离线分析终端</w:t>
+      </w:r>
+    </w:p>
+    <w:p>
+      <w:pPr>
+        <w:spacing w:after="120" w:line="264" w:lineRule="auto"/>
+      </w:pPr>
+      <w:r>
+        <w:rPr>
+          <w:rFonts w:ascii="Microsoft YaHei" w:hAnsi="Microsoft YaHei" w:eastAsia="Microsoft YaHei"/>
+        </w:rPr>
+        <w:t>本报告中的 PC 不是云端后台，也不是仅用于展示的通用桌面软件，而是放置在超声检查室、教学训练室或基层医疗点的本地分析设备。实际工作流中，超声机器或无线超声软件完成采集后，可把 PNG、DICOM/DCOM、cine 或视频导出到 USB、局域网共享目录、DICOM 工作站目录或本机指定文件夹，PC V5 从这些位置读取资料并完成本地预处理、特征提取、规则判断和 Gemma4 4B GGUF 报告生成。</w:t>
+      </w:r>
+    </w:p>
+    <w:p>
+      <w:pPr>
+        <w:spacing w:after="120" w:line="264" w:lineRule="auto"/>
+      </w:pPr>
+      <w:r>
+        <w:rPr>
+          <w:rFonts w:ascii="Microsoft YaHei" w:hAnsi="Microsoft YaHei" w:eastAsia="Microsoft YaHei"/>
+        </w:rPr>
+        <w:t>这种定位的目的有三点。第一，敏感图像和授权教学病例不需要上传云端，便于在网络不稳定或隐私要求高的场景中演示。第二，PC 能承担比手机更稳定的批量文件解析、视频抽帧、DICOM 兼容和 GGUF 常驻推理任务，适合作为超声设备旁的离线辅助终端。第三，输出始终限定为医学教学和基层参考，不替代正式超声报告、医师诊断、治疗建议或急诊分诊。</w:t>
+      </w:r>
+    </w:p>
+    <w:p>
+      <w:pPr>
+        <w:keepNext/>
+        <w:spacing w:before="320" w:after="160"/>
+      </w:pPr>
+      <w:r>
+        <w:rPr>
+          <w:rFonts w:ascii="Microsoft YaHei" w:hAnsi="Microsoft YaHei" w:eastAsia="Microsoft YaHei"/>
+          <w:b/>
+          <w:color w:val="2E74B5"/>
+          <w:sz w:val="32"/>
+        </w:rPr>
         <w:t>关键结论</w:t>
       </w:r>
     </w:p>
@@ -104,7 +148,7 @@
       </w:pPr>
       <w:r>
         <w:rPr>
-          <w:rFonts w:ascii="Calibri" w:hAnsi="Calibri" w:eastAsia="Microsoft YaHei"/>
+          <w:rFonts w:ascii="Microsoft YaHei" w:hAnsi="Microsoft YaHei" w:eastAsia="Microsoft YaHei"/>
         </w:rPr>
         <w:t>完整证据场景 60/60 例成功，平均 3.76 秒/例；12 帧代表抽样场景 60/60 例成功，平均 2.56 秒/例。</w:t>
       </w:r>
@@ -116,7 +160,7 @@
       </w:pPr>
       <w:r>
         <w:rPr>
-          <w:rFonts w:ascii="Calibri" w:hAnsi="Calibri" w:eastAsia="Microsoft YaHei"/>
+          <w:rFonts w:ascii="Microsoft YaHei" w:hAnsi="Microsoft YaHei" w:eastAsia="Microsoft YaHei"/>
         </w:rPr>
         <w:t>完整证据下 MR F1 为 0.964，AR F1 为 0.700，低 EF F1 为 0.857；MR 与低 EF 已达到较稳定的教学演示水平。</w:t>
       </w:r>
@@ -128,7 +172,7 @@
       </w:pPr>
       <w:r>
         <w:rPr>
-          <w:rFonts w:ascii="Calibri" w:hAnsi="Calibri" w:eastAsia="Microsoft YaHei"/>
+          <w:rFonts w:ascii="Microsoft YaHei" w:hAnsi="Microsoft YaHei" w:eastAsia="Microsoft YaHei"/>
         </w:rPr>
         <w:t>12 帧场景下 MR F1 仍为 0.936，但 AR F1 降至 0.326，说明主动脉瓣反流强依赖切面覆盖和彩色多普勒代表帧。</w:t>
       </w:r>
@@ -140,16 +184,23 @@
       </w:pPr>
       <w:r>
         <w:rPr>
-          <w:rFonts w:ascii="Calibri" w:hAnsi="Calibri" w:eastAsia="Microsoft YaHei"/>
+          <w:rFonts w:ascii="Microsoft YaHei" w:hAnsi="Microsoft YaHei" w:eastAsia="Microsoft YaHei"/>
         </w:rPr>
         <w:t>GGUF 本地生成建议使用常驻 llama-server：冷启动首次 completion 约 8.78 秒，热启动 completion 约 0.49 秒。</w:t>
       </w:r>
     </w:p>
     <w:p>
       <w:pPr>
-        <w:pStyle w:val="Heading1"/>
+        <w:keepNext/>
+        <w:spacing w:before="320" w:after="160"/>
       </w:pPr>
       <w:r>
+        <w:rPr>
+          <w:rFonts w:ascii="Microsoft YaHei" w:hAnsi="Microsoft YaHei" w:eastAsia="Microsoft YaHei"/>
+          <w:b/>
+          <w:color w:val="2E74B5"/>
+          <w:sz w:val="32"/>
+        </w:rPr>
         <w:t>完整证据场景：核心指标</w:t>
       </w:r>
     </w:p>
@@ -159,7 +210,7 @@
       </w:pPr>
       <w:r>
         <w:rPr>
-          <w:rFonts w:ascii="Calibri" w:hAnsi="Calibri" w:eastAsia="Microsoft YaHei"/>
+          <w:rFonts w:ascii="Microsoft YaHei" w:hAnsi="Microsoft YaHei" w:eastAsia="Microsoft YaHei"/>
         </w:rPr>
         <w:t>完整证据场景使用每例所有可用文件，平均 17.3 个文件/例，最多 33 个文件/例。该场景代表资料相对充分时的系统能力上限。TR 在本批数据中没有阴性样本，因此特异性不能作为有效结论。</w:t>
       </w:r>
@@ -212,7 +263,7 @@
             </w:pPr>
             <w:r>
               <w:rPr>
-                <w:rFonts w:ascii="Calibri" w:hAnsi="Calibri" w:eastAsia="Microsoft YaHei"/>
+                <w:rFonts w:ascii="Microsoft YaHei" w:hAnsi="Microsoft YaHei" w:eastAsia="Microsoft YaHei"/>
                 <w:b/>
                 <w:color w:val="000000"/>
                 <w:sz w:val="16"/>
@@ -240,7 +291,7 @@
             </w:pPr>
             <w:r>
               <w:rPr>
-                <w:rFonts w:ascii="Calibri" w:hAnsi="Calibri" w:eastAsia="Microsoft YaHei"/>
+                <w:rFonts w:ascii="Microsoft YaHei" w:hAnsi="Microsoft YaHei" w:eastAsia="Microsoft YaHei"/>
                 <w:b/>
                 <w:color w:val="000000"/>
                 <w:sz w:val="16"/>
@@ -268,7 +319,7 @@
             </w:pPr>
             <w:r>
               <w:rPr>
-                <w:rFonts w:ascii="Calibri" w:hAnsi="Calibri" w:eastAsia="Microsoft YaHei"/>
+                <w:rFonts w:ascii="Microsoft YaHei" w:hAnsi="Microsoft YaHei" w:eastAsia="Microsoft YaHei"/>
                 <w:b/>
                 <w:color w:val="000000"/>
                 <w:sz w:val="16"/>
@@ -296,7 +347,7 @@
             </w:pPr>
             <w:r>
               <w:rPr>
-                <w:rFonts w:ascii="Calibri" w:hAnsi="Calibri" w:eastAsia="Microsoft YaHei"/>
+                <w:rFonts w:ascii="Microsoft YaHei" w:hAnsi="Microsoft YaHei" w:eastAsia="Microsoft YaHei"/>
                 <w:b/>
                 <w:color w:val="000000"/>
                 <w:sz w:val="16"/>
@@ -324,7 +375,7 @@
             </w:pPr>
             <w:r>
               <w:rPr>
-                <w:rFonts w:ascii="Calibri" w:hAnsi="Calibri" w:eastAsia="Microsoft YaHei"/>
+                <w:rFonts w:ascii="Microsoft YaHei" w:hAnsi="Microsoft YaHei" w:eastAsia="Microsoft YaHei"/>
                 <w:b/>
                 <w:color w:val="000000"/>
                 <w:sz w:val="16"/>
@@ -352,7 +403,7 @@
             </w:pPr>
             <w:r>
               <w:rPr>
-                <w:rFonts w:ascii="Calibri" w:hAnsi="Calibri" w:eastAsia="Microsoft YaHei"/>
+                <w:rFonts w:ascii="Microsoft YaHei" w:hAnsi="Microsoft YaHei" w:eastAsia="Microsoft YaHei"/>
                 <w:b/>
                 <w:color w:val="000000"/>
                 <w:sz w:val="16"/>
@@ -380,7 +431,7 @@
             </w:pPr>
             <w:r>
               <w:rPr>
-                <w:rFonts w:ascii="Calibri" w:hAnsi="Calibri" w:eastAsia="Microsoft YaHei"/>
+                <w:rFonts w:ascii="Microsoft YaHei" w:hAnsi="Microsoft YaHei" w:eastAsia="Microsoft YaHei"/>
                 <w:b/>
                 <w:color w:val="000000"/>
                 <w:sz w:val="16"/>
@@ -412,7 +463,7 @@
             </w:pPr>
             <w:r>
               <w:rPr>
-                <w:rFonts w:ascii="Calibri" w:hAnsi="Calibri" w:eastAsia="Microsoft YaHei"/>
+                <w:rFonts w:ascii="Microsoft YaHei" w:hAnsi="Microsoft YaHei" w:eastAsia="Microsoft YaHei"/>
                 <w:b w:val="0"/>
                 <w:color w:val="000000"/>
                 <w:sz w:val="16"/>
@@ -439,7 +490,7 @@
             </w:pPr>
             <w:r>
               <w:rPr>
-                <w:rFonts w:ascii="Calibri" w:hAnsi="Calibri" w:eastAsia="Microsoft YaHei"/>
+                <w:rFonts w:ascii="Microsoft YaHei" w:hAnsi="Microsoft YaHei" w:eastAsia="Microsoft YaHei"/>
                 <w:b w:val="0"/>
                 <w:color w:val="000000"/>
                 <w:sz w:val="16"/>
@@ -466,7 +517,7 @@
             </w:pPr>
             <w:r>
               <w:rPr>
-                <w:rFonts w:ascii="Calibri" w:hAnsi="Calibri" w:eastAsia="Microsoft YaHei"/>
+                <w:rFonts w:ascii="Microsoft YaHei" w:hAnsi="Microsoft YaHei" w:eastAsia="Microsoft YaHei"/>
                 <w:b w:val="0"/>
                 <w:color w:val="000000"/>
                 <w:sz w:val="16"/>
@@ -493,7 +544,7 @@
             </w:pPr>
             <w:r>
               <w:rPr>
-                <w:rFonts w:ascii="Calibri" w:hAnsi="Calibri" w:eastAsia="Microsoft YaHei"/>
+                <w:rFonts w:ascii="Microsoft YaHei" w:hAnsi="Microsoft YaHei" w:eastAsia="Microsoft YaHei"/>
                 <w:b w:val="0"/>
                 <w:color w:val="000000"/>
                 <w:sz w:val="16"/>
@@ -520,7 +571,7 @@
             </w:pPr>
             <w:r>
               <w:rPr>
-                <w:rFonts w:ascii="Calibri" w:hAnsi="Calibri" w:eastAsia="Microsoft YaHei"/>
+                <w:rFonts w:ascii="Microsoft YaHei" w:hAnsi="Microsoft YaHei" w:eastAsia="Microsoft YaHei"/>
                 <w:b w:val="0"/>
                 <w:color w:val="000000"/>
                 <w:sz w:val="16"/>
@@ -547,7 +598,7 @@
             </w:pPr>
             <w:r>
               <w:rPr>
-                <w:rFonts w:ascii="Calibri" w:hAnsi="Calibri" w:eastAsia="Microsoft YaHei"/>
+                <w:rFonts w:ascii="Microsoft YaHei" w:hAnsi="Microsoft YaHei" w:eastAsia="Microsoft YaHei"/>
                 <w:b w:val="0"/>
                 <w:color w:val="000000"/>
                 <w:sz w:val="16"/>
@@ -574,7 +625,7 @@
             </w:pPr>
             <w:r>
               <w:rPr>
-                <w:rFonts w:ascii="Calibri" w:hAnsi="Calibri" w:eastAsia="Microsoft YaHei"/>
+                <w:rFonts w:ascii="Microsoft YaHei" w:hAnsi="Microsoft YaHei" w:eastAsia="Microsoft YaHei"/>
                 <w:b w:val="0"/>
                 <w:color w:val="000000"/>
                 <w:sz w:val="16"/>
@@ -606,7 +657,7 @@
             </w:pPr>
             <w:r>
               <w:rPr>
-                <w:rFonts w:ascii="Calibri" w:hAnsi="Calibri" w:eastAsia="Microsoft YaHei"/>
+                <w:rFonts w:ascii="Microsoft YaHei" w:hAnsi="Microsoft YaHei" w:eastAsia="Microsoft YaHei"/>
                 <w:b w:val="0"/>
                 <w:color w:val="000000"/>
                 <w:sz w:val="16"/>
@@ -633,7 +684,7 @@
             </w:pPr>
             <w:r>
               <w:rPr>
-                <w:rFonts w:ascii="Calibri" w:hAnsi="Calibri" w:eastAsia="Microsoft YaHei"/>
+                <w:rFonts w:ascii="Microsoft YaHei" w:hAnsi="Microsoft YaHei" w:eastAsia="Microsoft YaHei"/>
                 <w:b w:val="0"/>
                 <w:color w:val="000000"/>
                 <w:sz w:val="16"/>
@@ -660,7 +711,7 @@
             </w:pPr>
             <w:r>
               <w:rPr>
-                <w:rFonts w:ascii="Calibri" w:hAnsi="Calibri" w:eastAsia="Microsoft YaHei"/>
+                <w:rFonts w:ascii="Microsoft YaHei" w:hAnsi="Microsoft YaHei" w:eastAsia="Microsoft YaHei"/>
                 <w:b w:val="0"/>
                 <w:color w:val="000000"/>
                 <w:sz w:val="16"/>
@@ -687,7 +738,7 @@
             </w:pPr>
             <w:r>
               <w:rPr>
-                <w:rFonts w:ascii="Calibri" w:hAnsi="Calibri" w:eastAsia="Microsoft YaHei"/>
+                <w:rFonts w:ascii="Microsoft YaHei" w:hAnsi="Microsoft YaHei" w:eastAsia="Microsoft YaHei"/>
                 <w:b w:val="0"/>
                 <w:color w:val="000000"/>
                 <w:sz w:val="16"/>
@@ -714,7 +765,7 @@
             </w:pPr>
             <w:r>
               <w:rPr>
-                <w:rFonts w:ascii="Calibri" w:hAnsi="Calibri" w:eastAsia="Microsoft YaHei"/>
+                <w:rFonts w:ascii="Microsoft YaHei" w:hAnsi="Microsoft YaHei" w:eastAsia="Microsoft YaHei"/>
                 <w:b w:val="0"/>
                 <w:color w:val="000000"/>
                 <w:sz w:val="16"/>
@@ -741,7 +792,7 @@
             </w:pPr>
             <w:r>
               <w:rPr>
-                <w:rFonts w:ascii="Calibri" w:hAnsi="Calibri" w:eastAsia="Microsoft YaHei"/>
+                <w:rFonts w:ascii="Microsoft YaHei" w:hAnsi="Microsoft YaHei" w:eastAsia="Microsoft YaHei"/>
                 <w:b w:val="0"/>
                 <w:color w:val="000000"/>
                 <w:sz w:val="16"/>
@@ -768,7 +819,7 @@
             </w:pPr>
             <w:r>
               <w:rPr>
-                <w:rFonts w:ascii="Calibri" w:hAnsi="Calibri" w:eastAsia="Microsoft YaHei"/>
+                <w:rFonts w:ascii="Microsoft YaHei" w:hAnsi="Microsoft YaHei" w:eastAsia="Microsoft YaHei"/>
                 <w:b w:val="0"/>
                 <w:color w:val="000000"/>
                 <w:sz w:val="16"/>
@@ -800,7 +851,7 @@
             </w:pPr>
             <w:r>
               <w:rPr>
-                <w:rFonts w:ascii="Calibri" w:hAnsi="Calibri" w:eastAsia="Microsoft YaHei"/>
+                <w:rFonts w:ascii="Microsoft YaHei" w:hAnsi="Microsoft YaHei" w:eastAsia="Microsoft YaHei"/>
                 <w:b w:val="0"/>
                 <w:color w:val="000000"/>
                 <w:sz w:val="16"/>
@@ -827,7 +878,7 @@
             </w:pPr>
             <w:r>
               <w:rPr>
-                <w:rFonts w:ascii="Calibri" w:hAnsi="Calibri" w:eastAsia="Microsoft YaHei"/>
+                <w:rFonts w:ascii="Microsoft YaHei" w:hAnsi="Microsoft YaHei" w:eastAsia="Microsoft YaHei"/>
                 <w:b w:val="0"/>
                 <w:color w:val="000000"/>
                 <w:sz w:val="16"/>
@@ -854,7 +905,7 @@
             </w:pPr>
             <w:r>
               <w:rPr>
-                <w:rFonts w:ascii="Calibri" w:hAnsi="Calibri" w:eastAsia="Microsoft YaHei"/>
+                <w:rFonts w:ascii="Microsoft YaHei" w:hAnsi="Microsoft YaHei" w:eastAsia="Microsoft YaHei"/>
                 <w:b w:val="0"/>
                 <w:color w:val="000000"/>
                 <w:sz w:val="16"/>
@@ -881,7 +932,7 @@
             </w:pPr>
             <w:r>
               <w:rPr>
-                <w:rFonts w:ascii="Calibri" w:hAnsi="Calibri" w:eastAsia="Microsoft YaHei"/>
+                <w:rFonts w:ascii="Microsoft YaHei" w:hAnsi="Microsoft YaHei" w:eastAsia="Microsoft YaHei"/>
                 <w:b w:val="0"/>
                 <w:color w:val="000000"/>
                 <w:sz w:val="16"/>
@@ -908,7 +959,7 @@
             </w:pPr>
             <w:r>
               <w:rPr>
-                <w:rFonts w:ascii="Calibri" w:hAnsi="Calibri" w:eastAsia="Microsoft YaHei"/>
+                <w:rFonts w:ascii="Microsoft YaHei" w:hAnsi="Microsoft YaHei" w:eastAsia="Microsoft YaHei"/>
                 <w:b w:val="0"/>
                 <w:color w:val="000000"/>
                 <w:sz w:val="16"/>
@@ -935,7 +986,7 @@
             </w:pPr>
             <w:r>
               <w:rPr>
-                <w:rFonts w:ascii="Calibri" w:hAnsi="Calibri" w:eastAsia="Microsoft YaHei"/>
+                <w:rFonts w:ascii="Microsoft YaHei" w:hAnsi="Microsoft YaHei" w:eastAsia="Microsoft YaHei"/>
                 <w:b w:val="0"/>
                 <w:color w:val="000000"/>
                 <w:sz w:val="16"/>
@@ -962,7 +1013,7 @@
             </w:pPr>
             <w:r>
               <w:rPr>
-                <w:rFonts w:ascii="Calibri" w:hAnsi="Calibri" w:eastAsia="Microsoft YaHei"/>
+                <w:rFonts w:ascii="Microsoft YaHei" w:hAnsi="Microsoft YaHei" w:eastAsia="Microsoft YaHei"/>
                 <w:b w:val="0"/>
                 <w:color w:val="000000"/>
                 <w:sz w:val="16"/>
@@ -994,7 +1045,7 @@
             </w:pPr>
             <w:r>
               <w:rPr>
-                <w:rFonts w:ascii="Calibri" w:hAnsi="Calibri" w:eastAsia="Microsoft YaHei"/>
+                <w:rFonts w:ascii="Microsoft YaHei" w:hAnsi="Microsoft YaHei" w:eastAsia="Microsoft YaHei"/>
                 <w:b w:val="0"/>
                 <w:color w:val="000000"/>
                 <w:sz w:val="16"/>
@@ -1021,7 +1072,7 @@
             </w:pPr>
             <w:r>
               <w:rPr>
-                <w:rFonts w:ascii="Calibri" w:hAnsi="Calibri" w:eastAsia="Microsoft YaHei"/>
+                <w:rFonts w:ascii="Microsoft YaHei" w:hAnsi="Microsoft YaHei" w:eastAsia="Microsoft YaHei"/>
                 <w:b w:val="0"/>
                 <w:color w:val="000000"/>
                 <w:sz w:val="16"/>
@@ -1048,7 +1099,7 @@
             </w:pPr>
             <w:r>
               <w:rPr>
-                <w:rFonts w:ascii="Calibri" w:hAnsi="Calibri" w:eastAsia="Microsoft YaHei"/>
+                <w:rFonts w:ascii="Microsoft YaHei" w:hAnsi="Microsoft YaHei" w:eastAsia="Microsoft YaHei"/>
                 <w:b w:val="0"/>
                 <w:color w:val="000000"/>
                 <w:sz w:val="16"/>
@@ -1075,7 +1126,7 @@
             </w:pPr>
             <w:r>
               <w:rPr>
-                <w:rFonts w:ascii="Calibri" w:hAnsi="Calibri" w:eastAsia="Microsoft YaHei"/>
+                <w:rFonts w:ascii="Microsoft YaHei" w:hAnsi="Microsoft YaHei" w:eastAsia="Microsoft YaHei"/>
                 <w:b w:val="0"/>
                 <w:color w:val="000000"/>
                 <w:sz w:val="16"/>
@@ -1102,7 +1153,7 @@
             </w:pPr>
             <w:r>
               <w:rPr>
-                <w:rFonts w:ascii="Calibri" w:hAnsi="Calibri" w:eastAsia="Microsoft YaHei"/>
+                <w:rFonts w:ascii="Microsoft YaHei" w:hAnsi="Microsoft YaHei" w:eastAsia="Microsoft YaHei"/>
                 <w:b w:val="0"/>
                 <w:color w:val="000000"/>
                 <w:sz w:val="16"/>
@@ -1129,7 +1180,7 @@
             </w:pPr>
             <w:r>
               <w:rPr>
-                <w:rFonts w:ascii="Calibri" w:hAnsi="Calibri" w:eastAsia="Microsoft YaHei"/>
+                <w:rFonts w:ascii="Microsoft YaHei" w:hAnsi="Microsoft YaHei" w:eastAsia="Microsoft YaHei"/>
                 <w:b w:val="0"/>
                 <w:color w:val="000000"/>
                 <w:sz w:val="16"/>
@@ -1156,7 +1207,7 @@
             </w:pPr>
             <w:r>
               <w:rPr>
-                <w:rFonts w:ascii="Calibri" w:hAnsi="Calibri" w:eastAsia="Microsoft YaHei"/>
+                <w:rFonts w:ascii="Microsoft YaHei" w:hAnsi="Microsoft YaHei" w:eastAsia="Microsoft YaHei"/>
                 <w:b w:val="0"/>
                 <w:color w:val="000000"/>
                 <w:sz w:val="16"/>
@@ -1188,7 +1239,7 @@
             </w:pPr>
             <w:r>
               <w:rPr>
-                <w:rFonts w:ascii="Calibri" w:hAnsi="Calibri" w:eastAsia="Microsoft YaHei"/>
+                <w:rFonts w:ascii="Microsoft YaHei" w:hAnsi="Microsoft YaHei" w:eastAsia="Microsoft YaHei"/>
                 <w:b w:val="0"/>
                 <w:color w:val="000000"/>
                 <w:sz w:val="16"/>
@@ -1215,7 +1266,7 @@
             </w:pPr>
             <w:r>
               <w:rPr>
-                <w:rFonts w:ascii="Calibri" w:hAnsi="Calibri" w:eastAsia="Microsoft YaHei"/>
+                <w:rFonts w:ascii="Microsoft YaHei" w:hAnsi="Microsoft YaHei" w:eastAsia="Microsoft YaHei"/>
                 <w:b w:val="0"/>
                 <w:color w:val="000000"/>
                 <w:sz w:val="16"/>
@@ -1242,7 +1293,7 @@
             </w:pPr>
             <w:r>
               <w:rPr>
-                <w:rFonts w:ascii="Calibri" w:hAnsi="Calibri" w:eastAsia="Microsoft YaHei"/>
+                <w:rFonts w:ascii="Microsoft YaHei" w:hAnsi="Microsoft YaHei" w:eastAsia="Microsoft YaHei"/>
                 <w:b w:val="0"/>
                 <w:color w:val="000000"/>
                 <w:sz w:val="16"/>
@@ -1269,7 +1320,7 @@
             </w:pPr>
             <w:r>
               <w:rPr>
-                <w:rFonts w:ascii="Calibri" w:hAnsi="Calibri" w:eastAsia="Microsoft YaHei"/>
+                <w:rFonts w:ascii="Microsoft YaHei" w:hAnsi="Microsoft YaHei" w:eastAsia="Microsoft YaHei"/>
                 <w:b w:val="0"/>
                 <w:color w:val="000000"/>
                 <w:sz w:val="16"/>
@@ -1296,7 +1347,7 @@
             </w:pPr>
             <w:r>
               <w:rPr>
-                <w:rFonts w:ascii="Calibri" w:hAnsi="Calibri" w:eastAsia="Microsoft YaHei"/>
+                <w:rFonts w:ascii="Microsoft YaHei" w:hAnsi="Microsoft YaHei" w:eastAsia="Microsoft YaHei"/>
                 <w:b w:val="0"/>
                 <w:color w:val="000000"/>
                 <w:sz w:val="16"/>
@@ -1323,7 +1374,7 @@
             </w:pPr>
             <w:r>
               <w:rPr>
-                <w:rFonts w:ascii="Calibri" w:hAnsi="Calibri" w:eastAsia="Microsoft YaHei"/>
+                <w:rFonts w:ascii="Microsoft YaHei" w:hAnsi="Microsoft YaHei" w:eastAsia="Microsoft YaHei"/>
                 <w:b w:val="0"/>
                 <w:color w:val="000000"/>
                 <w:sz w:val="16"/>
@@ -1350,7 +1401,7 @@
             </w:pPr>
             <w:r>
               <w:rPr>
-                <w:rFonts w:ascii="Calibri" w:hAnsi="Calibri" w:eastAsia="Microsoft YaHei"/>
+                <w:rFonts w:ascii="Microsoft YaHei" w:hAnsi="Microsoft YaHei" w:eastAsia="Microsoft YaHei"/>
                 <w:b w:val="0"/>
                 <w:color w:val="000000"/>
                 <w:sz w:val="16"/>
@@ -1382,7 +1433,7 @@
             </w:pPr>
             <w:r>
               <w:rPr>
-                <w:rFonts w:ascii="Calibri" w:hAnsi="Calibri" w:eastAsia="Microsoft YaHei"/>
+                <w:rFonts w:ascii="Microsoft YaHei" w:hAnsi="Microsoft YaHei" w:eastAsia="Microsoft YaHei"/>
                 <w:b w:val="0"/>
                 <w:color w:val="000000"/>
                 <w:sz w:val="16"/>
@@ -1409,7 +1460,7 @@
             </w:pPr>
             <w:r>
               <w:rPr>
-                <w:rFonts w:ascii="Calibri" w:hAnsi="Calibri" w:eastAsia="Microsoft YaHei"/>
+                <w:rFonts w:ascii="Microsoft YaHei" w:hAnsi="Microsoft YaHei" w:eastAsia="Microsoft YaHei"/>
                 <w:b w:val="0"/>
                 <w:color w:val="000000"/>
                 <w:sz w:val="16"/>
@@ -1436,7 +1487,7 @@
             </w:pPr>
             <w:r>
               <w:rPr>
-                <w:rFonts w:ascii="Calibri" w:hAnsi="Calibri" w:eastAsia="Microsoft YaHei"/>
+                <w:rFonts w:ascii="Microsoft YaHei" w:hAnsi="Microsoft YaHei" w:eastAsia="Microsoft YaHei"/>
                 <w:b w:val="0"/>
                 <w:color w:val="000000"/>
                 <w:sz w:val="16"/>
@@ -1463,7 +1514,7 @@
             </w:pPr>
             <w:r>
               <w:rPr>
-                <w:rFonts w:ascii="Calibri" w:hAnsi="Calibri" w:eastAsia="Microsoft YaHei"/>
+                <w:rFonts w:ascii="Microsoft YaHei" w:hAnsi="Microsoft YaHei" w:eastAsia="Microsoft YaHei"/>
                 <w:b w:val="0"/>
                 <w:color w:val="000000"/>
                 <w:sz w:val="16"/>
@@ -1490,7 +1541,7 @@
             </w:pPr>
             <w:r>
               <w:rPr>
-                <w:rFonts w:ascii="Calibri" w:hAnsi="Calibri" w:eastAsia="Microsoft YaHei"/>
+                <w:rFonts w:ascii="Microsoft YaHei" w:hAnsi="Microsoft YaHei" w:eastAsia="Microsoft YaHei"/>
                 <w:b w:val="0"/>
                 <w:color w:val="000000"/>
                 <w:sz w:val="16"/>
@@ -1517,7 +1568,7 @@
             </w:pPr>
             <w:r>
               <w:rPr>
-                <w:rFonts w:ascii="Calibri" w:hAnsi="Calibri" w:eastAsia="Microsoft YaHei"/>
+                <w:rFonts w:ascii="Microsoft YaHei" w:hAnsi="Microsoft YaHei" w:eastAsia="Microsoft YaHei"/>
                 <w:b w:val="0"/>
                 <w:color w:val="000000"/>
                 <w:sz w:val="16"/>
@@ -1544,7 +1595,7 @@
             </w:pPr>
             <w:r>
               <w:rPr>
-                <w:rFonts w:ascii="Calibri" w:hAnsi="Calibri" w:eastAsia="Microsoft YaHei"/>
+                <w:rFonts w:ascii="Microsoft YaHei" w:hAnsi="Microsoft YaHei" w:eastAsia="Microsoft YaHei"/>
                 <w:b w:val="0"/>
                 <w:color w:val="000000"/>
                 <w:sz w:val="16"/>
@@ -1602,7 +1653,7 @@
       </w:pPr>
       <w:r>
         <w:rPr>
-          <w:rFonts w:ascii="Calibri" w:hAnsi="Calibri" w:eastAsia="Microsoft YaHei"/>
+          <w:rFonts w:ascii="Microsoft YaHei" w:hAnsi="Microsoft YaHei" w:eastAsia="Microsoft YaHei"/>
           <w:i/>
           <w:color w:val="555555"/>
           <w:sz w:val="19"/>
@@ -1612,9 +1663,16 @@
     </w:p>
     <w:p>
       <w:pPr>
-        <w:pStyle w:val="Heading1"/>
+        <w:keepNext/>
+        <w:spacing w:before="320" w:after="160"/>
       </w:pPr>
       <w:r>
+        <w:rPr>
+          <w:rFonts w:ascii="Microsoft YaHei" w:hAnsi="Microsoft YaHei" w:eastAsia="Microsoft YaHei"/>
+          <w:b/>
+          <w:color w:val="2E74B5"/>
+          <w:sz w:val="32"/>
+        </w:rPr>
         <w:t>12 帧代表抽样：输入受限场景</w:t>
       </w:r>
     </w:p>
@@ -1624,7 +1682,7 @@
       </w:pPr>
       <w:r>
         <w:rPr>
-          <w:rFonts w:ascii="Calibri" w:hAnsi="Calibri" w:eastAsia="Microsoft YaHei"/>
+          <w:rFonts w:ascii="Microsoft YaHei" w:hAnsi="Microsoft YaHei" w:eastAsia="Microsoft YaHei"/>
         </w:rPr>
         <w:t>12 帧场景将每例文件做均匀代表抽样，而不是只取前 12 个文件。该场景更接近现场演示和标准输入上限，但会牺牲部分细粒度病症定位能力。</w:t>
       </w:r>
@@ -1677,7 +1735,7 @@
             </w:pPr>
             <w:r>
               <w:rPr>
-                <w:rFonts w:ascii="Calibri" w:hAnsi="Calibri" w:eastAsia="Microsoft YaHei"/>
+                <w:rFonts w:ascii="Microsoft YaHei" w:hAnsi="Microsoft YaHei" w:eastAsia="Microsoft YaHei"/>
                 <w:b/>
                 <w:color w:val="000000"/>
                 <w:sz w:val="16"/>
@@ -1705,7 +1763,7 @@
             </w:pPr>
             <w:r>
               <w:rPr>
-                <w:rFonts w:ascii="Calibri" w:hAnsi="Calibri" w:eastAsia="Microsoft YaHei"/>
+                <w:rFonts w:ascii="Microsoft YaHei" w:hAnsi="Microsoft YaHei" w:eastAsia="Microsoft YaHei"/>
                 <w:b/>
                 <w:color w:val="000000"/>
                 <w:sz w:val="16"/>
@@ -1733,7 +1791,7 @@
             </w:pPr>
             <w:r>
               <w:rPr>
-                <w:rFonts w:ascii="Calibri" w:hAnsi="Calibri" w:eastAsia="Microsoft YaHei"/>
+                <w:rFonts w:ascii="Microsoft YaHei" w:hAnsi="Microsoft YaHei" w:eastAsia="Microsoft YaHei"/>
                 <w:b/>
                 <w:color w:val="000000"/>
                 <w:sz w:val="16"/>
@@ -1761,7 +1819,7 @@
             </w:pPr>
             <w:r>
               <w:rPr>
-                <w:rFonts w:ascii="Calibri" w:hAnsi="Calibri" w:eastAsia="Microsoft YaHei"/>
+                <w:rFonts w:ascii="Microsoft YaHei" w:hAnsi="Microsoft YaHei" w:eastAsia="Microsoft YaHei"/>
                 <w:b/>
                 <w:color w:val="000000"/>
                 <w:sz w:val="16"/>
@@ -1789,7 +1847,7 @@
             </w:pPr>
             <w:r>
               <w:rPr>
-                <w:rFonts w:ascii="Calibri" w:hAnsi="Calibri" w:eastAsia="Microsoft YaHei"/>
+                <w:rFonts w:ascii="Microsoft YaHei" w:hAnsi="Microsoft YaHei" w:eastAsia="Microsoft YaHei"/>
                 <w:b/>
                 <w:color w:val="000000"/>
                 <w:sz w:val="16"/>
@@ -1817,7 +1875,7 @@
             </w:pPr>
             <w:r>
               <w:rPr>
-                <w:rFonts w:ascii="Calibri" w:hAnsi="Calibri" w:eastAsia="Microsoft YaHei"/>
+                <w:rFonts w:ascii="Microsoft YaHei" w:hAnsi="Microsoft YaHei" w:eastAsia="Microsoft YaHei"/>
                 <w:b/>
                 <w:color w:val="000000"/>
                 <w:sz w:val="16"/>
@@ -1845,7 +1903,7 @@
             </w:pPr>
             <w:r>
               <w:rPr>
-                <w:rFonts w:ascii="Calibri" w:hAnsi="Calibri" w:eastAsia="Microsoft YaHei"/>
+                <w:rFonts w:ascii="Microsoft YaHei" w:hAnsi="Microsoft YaHei" w:eastAsia="Microsoft YaHei"/>
                 <w:b/>
                 <w:color w:val="000000"/>
                 <w:sz w:val="16"/>
@@ -1877,7 +1935,7 @@
             </w:pPr>
             <w:r>
               <w:rPr>
-                <w:rFonts w:ascii="Calibri" w:hAnsi="Calibri" w:eastAsia="Microsoft YaHei"/>
+                <w:rFonts w:ascii="Microsoft YaHei" w:hAnsi="Microsoft YaHei" w:eastAsia="Microsoft YaHei"/>
                 <w:b w:val="0"/>
                 <w:color w:val="000000"/>
                 <w:sz w:val="16"/>
@@ -1904,7 +1962,7 @@
             </w:pPr>
             <w:r>
               <w:rPr>
-                <w:rFonts w:ascii="Calibri" w:hAnsi="Calibri" w:eastAsia="Microsoft YaHei"/>
+                <w:rFonts w:ascii="Microsoft YaHei" w:hAnsi="Microsoft YaHei" w:eastAsia="Microsoft YaHei"/>
                 <w:b w:val="0"/>
                 <w:color w:val="000000"/>
                 <w:sz w:val="16"/>
@@ -1931,7 +1989,7 @@
             </w:pPr>
             <w:r>
               <w:rPr>
-                <w:rFonts w:ascii="Calibri" w:hAnsi="Calibri" w:eastAsia="Microsoft YaHei"/>
+                <w:rFonts w:ascii="Microsoft YaHei" w:hAnsi="Microsoft YaHei" w:eastAsia="Microsoft YaHei"/>
                 <w:b w:val="0"/>
                 <w:color w:val="000000"/>
                 <w:sz w:val="16"/>
@@ -1958,7 +2016,7 @@
             </w:pPr>
             <w:r>
               <w:rPr>
-                <w:rFonts w:ascii="Calibri" w:hAnsi="Calibri" w:eastAsia="Microsoft YaHei"/>
+                <w:rFonts w:ascii="Microsoft YaHei" w:hAnsi="Microsoft YaHei" w:eastAsia="Microsoft YaHei"/>
                 <w:b w:val="0"/>
                 <w:color w:val="000000"/>
                 <w:sz w:val="16"/>
@@ -1985,7 +2043,7 @@
             </w:pPr>
             <w:r>
               <w:rPr>
-                <w:rFonts w:ascii="Calibri" w:hAnsi="Calibri" w:eastAsia="Microsoft YaHei"/>
+                <w:rFonts w:ascii="Microsoft YaHei" w:hAnsi="Microsoft YaHei" w:eastAsia="Microsoft YaHei"/>
                 <w:b w:val="0"/>
                 <w:color w:val="000000"/>
                 <w:sz w:val="16"/>
@@ -2012,7 +2070,7 @@
             </w:pPr>
             <w:r>
               <w:rPr>
-                <w:rFonts w:ascii="Calibri" w:hAnsi="Calibri" w:eastAsia="Microsoft YaHei"/>
+                <w:rFonts w:ascii="Microsoft YaHei" w:hAnsi="Microsoft YaHei" w:eastAsia="Microsoft YaHei"/>
                 <w:b w:val="0"/>
                 <w:color w:val="000000"/>
                 <w:sz w:val="16"/>
@@ -2039,7 +2097,7 @@
             </w:pPr>
             <w:r>
               <w:rPr>
-                <w:rFonts w:ascii="Calibri" w:hAnsi="Calibri" w:eastAsia="Microsoft YaHei"/>
+                <w:rFonts w:ascii="Microsoft YaHei" w:hAnsi="Microsoft YaHei" w:eastAsia="Microsoft YaHei"/>
                 <w:b w:val="0"/>
                 <w:color w:val="000000"/>
                 <w:sz w:val="16"/>
@@ -2071,7 +2129,7 @@
             </w:pPr>
             <w:r>
               <w:rPr>
-                <w:rFonts w:ascii="Calibri" w:hAnsi="Calibri" w:eastAsia="Microsoft YaHei"/>
+                <w:rFonts w:ascii="Microsoft YaHei" w:hAnsi="Microsoft YaHei" w:eastAsia="Microsoft YaHei"/>
                 <w:b w:val="0"/>
                 <w:color w:val="000000"/>
                 <w:sz w:val="16"/>
@@ -2098,7 +2156,7 @@
             </w:pPr>
             <w:r>
               <w:rPr>
-                <w:rFonts w:ascii="Calibri" w:hAnsi="Calibri" w:eastAsia="Microsoft YaHei"/>
+                <w:rFonts w:ascii="Microsoft YaHei" w:hAnsi="Microsoft YaHei" w:eastAsia="Microsoft YaHei"/>
                 <w:b w:val="0"/>
                 <w:color w:val="000000"/>
                 <w:sz w:val="16"/>
@@ -2125,7 +2183,7 @@
             </w:pPr>
             <w:r>
               <w:rPr>
-                <w:rFonts w:ascii="Calibri" w:hAnsi="Calibri" w:eastAsia="Microsoft YaHei"/>
+                <w:rFonts w:ascii="Microsoft YaHei" w:hAnsi="Microsoft YaHei" w:eastAsia="Microsoft YaHei"/>
                 <w:b w:val="0"/>
                 <w:color w:val="000000"/>
                 <w:sz w:val="16"/>
@@ -2152,7 +2210,7 @@
             </w:pPr>
             <w:r>
               <w:rPr>
-                <w:rFonts w:ascii="Calibri" w:hAnsi="Calibri" w:eastAsia="Microsoft YaHei"/>
+                <w:rFonts w:ascii="Microsoft YaHei" w:hAnsi="Microsoft YaHei" w:eastAsia="Microsoft YaHei"/>
                 <w:b w:val="0"/>
                 <w:color w:val="000000"/>
                 <w:sz w:val="16"/>
@@ -2179,7 +2237,7 @@
             </w:pPr>
             <w:r>
               <w:rPr>
-                <w:rFonts w:ascii="Calibri" w:hAnsi="Calibri" w:eastAsia="Microsoft YaHei"/>
+                <w:rFonts w:ascii="Microsoft YaHei" w:hAnsi="Microsoft YaHei" w:eastAsia="Microsoft YaHei"/>
                 <w:b w:val="0"/>
                 <w:color w:val="000000"/>
                 <w:sz w:val="16"/>
@@ -2206,7 +2264,7 @@
             </w:pPr>
             <w:r>
               <w:rPr>
-                <w:rFonts w:ascii="Calibri" w:hAnsi="Calibri" w:eastAsia="Microsoft YaHei"/>
+                <w:rFonts w:ascii="Microsoft YaHei" w:hAnsi="Microsoft YaHei" w:eastAsia="Microsoft YaHei"/>
                 <w:b w:val="0"/>
                 <w:color w:val="000000"/>
                 <w:sz w:val="16"/>
@@ -2233,7 +2291,7 @@
             </w:pPr>
             <w:r>
               <w:rPr>
-                <w:rFonts w:ascii="Calibri" w:hAnsi="Calibri" w:eastAsia="Microsoft YaHei"/>
+                <w:rFonts w:ascii="Microsoft YaHei" w:hAnsi="Microsoft YaHei" w:eastAsia="Microsoft YaHei"/>
                 <w:b w:val="0"/>
                 <w:color w:val="000000"/>
                 <w:sz w:val="16"/>
@@ -2265,7 +2323,7 @@
             </w:pPr>
             <w:r>
               <w:rPr>
-                <w:rFonts w:ascii="Calibri" w:hAnsi="Calibri" w:eastAsia="Microsoft YaHei"/>
+                <w:rFonts w:ascii="Microsoft YaHei" w:hAnsi="Microsoft YaHei" w:eastAsia="Microsoft YaHei"/>
                 <w:b w:val="0"/>
                 <w:color w:val="000000"/>
                 <w:sz w:val="16"/>
@@ -2292,7 +2350,7 @@
             </w:pPr>
             <w:r>
               <w:rPr>
-                <w:rFonts w:ascii="Calibri" w:hAnsi="Calibri" w:eastAsia="Microsoft YaHei"/>
+                <w:rFonts w:ascii="Microsoft YaHei" w:hAnsi="Microsoft YaHei" w:eastAsia="Microsoft YaHei"/>
                 <w:b w:val="0"/>
                 <w:color w:val="000000"/>
                 <w:sz w:val="16"/>
@@ -2319,7 +2377,7 @@
             </w:pPr>
             <w:r>
               <w:rPr>
-                <w:rFonts w:ascii="Calibri" w:hAnsi="Calibri" w:eastAsia="Microsoft YaHei"/>
+                <w:rFonts w:ascii="Microsoft YaHei" w:hAnsi="Microsoft YaHei" w:eastAsia="Microsoft YaHei"/>
                 <w:b w:val="0"/>
                 <w:color w:val="000000"/>
                 <w:sz w:val="16"/>
@@ -2346,7 +2404,7 @@
             </w:pPr>
             <w:r>
               <w:rPr>
-                <w:rFonts w:ascii="Calibri" w:hAnsi="Calibri" w:eastAsia="Microsoft YaHei"/>
+                <w:rFonts w:ascii="Microsoft YaHei" w:hAnsi="Microsoft YaHei" w:eastAsia="Microsoft YaHei"/>
                 <w:b w:val="0"/>
                 <w:color w:val="000000"/>
                 <w:sz w:val="16"/>
@@ -2373,7 +2431,7 @@
             </w:pPr>
             <w:r>
               <w:rPr>
-                <w:rFonts w:ascii="Calibri" w:hAnsi="Calibri" w:eastAsia="Microsoft YaHei"/>
+                <w:rFonts w:ascii="Microsoft YaHei" w:hAnsi="Microsoft YaHei" w:eastAsia="Microsoft YaHei"/>
                 <w:b w:val="0"/>
                 <w:color w:val="000000"/>
                 <w:sz w:val="16"/>
@@ -2400,7 +2458,7 @@
             </w:pPr>
             <w:r>
               <w:rPr>
-                <w:rFonts w:ascii="Calibri" w:hAnsi="Calibri" w:eastAsia="Microsoft YaHei"/>
+                <w:rFonts w:ascii="Microsoft YaHei" w:hAnsi="Microsoft YaHei" w:eastAsia="Microsoft YaHei"/>
                 <w:b w:val="0"/>
                 <w:color w:val="000000"/>
                 <w:sz w:val="16"/>
@@ -2427,7 +2485,7 @@
             </w:pPr>
             <w:r>
               <w:rPr>
-                <w:rFonts w:ascii="Calibri" w:hAnsi="Calibri" w:eastAsia="Microsoft YaHei"/>
+                <w:rFonts w:ascii="Microsoft YaHei" w:hAnsi="Microsoft YaHei" w:eastAsia="Microsoft YaHei"/>
                 <w:b w:val="0"/>
                 <w:color w:val="000000"/>
                 <w:sz w:val="16"/>
@@ -2459,7 +2517,7 @@
             </w:pPr>
             <w:r>
               <w:rPr>
-                <w:rFonts w:ascii="Calibri" w:hAnsi="Calibri" w:eastAsia="Microsoft YaHei"/>
+                <w:rFonts w:ascii="Microsoft YaHei" w:hAnsi="Microsoft YaHei" w:eastAsia="Microsoft YaHei"/>
                 <w:b w:val="0"/>
                 <w:color w:val="000000"/>
                 <w:sz w:val="16"/>
@@ -2486,7 +2544,7 @@
             </w:pPr>
             <w:r>
               <w:rPr>
-                <w:rFonts w:ascii="Calibri" w:hAnsi="Calibri" w:eastAsia="Microsoft YaHei"/>
+                <w:rFonts w:ascii="Microsoft YaHei" w:hAnsi="Microsoft YaHei" w:eastAsia="Microsoft YaHei"/>
                 <w:b w:val="0"/>
                 <w:color w:val="000000"/>
                 <w:sz w:val="16"/>
@@ -2513,7 +2571,7 @@
             </w:pPr>
             <w:r>
               <w:rPr>
-                <w:rFonts w:ascii="Calibri" w:hAnsi="Calibri" w:eastAsia="Microsoft YaHei"/>
+                <w:rFonts w:ascii="Microsoft YaHei" w:hAnsi="Microsoft YaHei" w:eastAsia="Microsoft YaHei"/>
                 <w:b w:val="0"/>
                 <w:color w:val="000000"/>
                 <w:sz w:val="16"/>
@@ -2540,7 +2598,7 @@
             </w:pPr>
             <w:r>
               <w:rPr>
-                <w:rFonts w:ascii="Calibri" w:hAnsi="Calibri" w:eastAsia="Microsoft YaHei"/>
+                <w:rFonts w:ascii="Microsoft YaHei" w:hAnsi="Microsoft YaHei" w:eastAsia="Microsoft YaHei"/>
                 <w:b w:val="0"/>
                 <w:color w:val="000000"/>
                 <w:sz w:val="16"/>
@@ -2567,7 +2625,7 @@
             </w:pPr>
             <w:r>
               <w:rPr>
-                <w:rFonts w:ascii="Calibri" w:hAnsi="Calibri" w:eastAsia="Microsoft YaHei"/>
+                <w:rFonts w:ascii="Microsoft YaHei" w:hAnsi="Microsoft YaHei" w:eastAsia="Microsoft YaHei"/>
                 <w:b w:val="0"/>
                 <w:color w:val="000000"/>
                 <w:sz w:val="16"/>
@@ -2594,7 +2652,7 @@
             </w:pPr>
             <w:r>
               <w:rPr>
-                <w:rFonts w:ascii="Calibri" w:hAnsi="Calibri" w:eastAsia="Microsoft YaHei"/>
+                <w:rFonts w:ascii="Microsoft YaHei" w:hAnsi="Microsoft YaHei" w:eastAsia="Microsoft YaHei"/>
                 <w:b w:val="0"/>
                 <w:color w:val="000000"/>
                 <w:sz w:val="16"/>
@@ -2621,7 +2679,7 @@
             </w:pPr>
             <w:r>
               <w:rPr>
-                <w:rFonts w:ascii="Calibri" w:hAnsi="Calibri" w:eastAsia="Microsoft YaHei"/>
+                <w:rFonts w:ascii="Microsoft YaHei" w:hAnsi="Microsoft YaHei" w:eastAsia="Microsoft YaHei"/>
                 <w:b w:val="0"/>
                 <w:color w:val="000000"/>
                 <w:sz w:val="16"/>
@@ -2653,7 +2711,7 @@
             </w:pPr>
             <w:r>
               <w:rPr>
-                <w:rFonts w:ascii="Calibri" w:hAnsi="Calibri" w:eastAsia="Microsoft YaHei"/>
+                <w:rFonts w:ascii="Microsoft YaHei" w:hAnsi="Microsoft YaHei" w:eastAsia="Microsoft YaHei"/>
                 <w:b w:val="0"/>
                 <w:color w:val="000000"/>
                 <w:sz w:val="16"/>
@@ -2680,7 +2738,7 @@
             </w:pPr>
             <w:r>
               <w:rPr>
-                <w:rFonts w:ascii="Calibri" w:hAnsi="Calibri" w:eastAsia="Microsoft YaHei"/>
+                <w:rFonts w:ascii="Microsoft YaHei" w:hAnsi="Microsoft YaHei" w:eastAsia="Microsoft YaHei"/>
                 <w:b w:val="0"/>
                 <w:color w:val="000000"/>
                 <w:sz w:val="16"/>
@@ -2707,7 +2765,7 @@
             </w:pPr>
             <w:r>
               <w:rPr>
-                <w:rFonts w:ascii="Calibri" w:hAnsi="Calibri" w:eastAsia="Microsoft YaHei"/>
+                <w:rFonts w:ascii="Microsoft YaHei" w:hAnsi="Microsoft YaHei" w:eastAsia="Microsoft YaHei"/>
                 <w:b w:val="0"/>
                 <w:color w:val="000000"/>
                 <w:sz w:val="16"/>
@@ -2734,7 +2792,7 @@
             </w:pPr>
             <w:r>
               <w:rPr>
-                <w:rFonts w:ascii="Calibri" w:hAnsi="Calibri" w:eastAsia="Microsoft YaHei"/>
+                <w:rFonts w:ascii="Microsoft YaHei" w:hAnsi="Microsoft YaHei" w:eastAsia="Microsoft YaHei"/>
                 <w:b w:val="0"/>
                 <w:color w:val="000000"/>
                 <w:sz w:val="16"/>
@@ -2761,7 +2819,7 @@
             </w:pPr>
             <w:r>
               <w:rPr>
-                <w:rFonts w:ascii="Calibri" w:hAnsi="Calibri" w:eastAsia="Microsoft YaHei"/>
+                <w:rFonts w:ascii="Microsoft YaHei" w:hAnsi="Microsoft YaHei" w:eastAsia="Microsoft YaHei"/>
                 <w:b w:val="0"/>
                 <w:color w:val="000000"/>
                 <w:sz w:val="16"/>
@@ -2788,7 +2846,7 @@
             </w:pPr>
             <w:r>
               <w:rPr>
-                <w:rFonts w:ascii="Calibri" w:hAnsi="Calibri" w:eastAsia="Microsoft YaHei"/>
+                <w:rFonts w:ascii="Microsoft YaHei" w:hAnsi="Microsoft YaHei" w:eastAsia="Microsoft YaHei"/>
                 <w:b w:val="0"/>
                 <w:color w:val="000000"/>
                 <w:sz w:val="16"/>
@@ -2815,7 +2873,7 @@
             </w:pPr>
             <w:r>
               <w:rPr>
-                <w:rFonts w:ascii="Calibri" w:hAnsi="Calibri" w:eastAsia="Microsoft YaHei"/>
+                <w:rFonts w:ascii="Microsoft YaHei" w:hAnsi="Microsoft YaHei" w:eastAsia="Microsoft YaHei"/>
                 <w:b w:val="0"/>
                 <w:color w:val="000000"/>
                 <w:sz w:val="16"/>
@@ -2847,7 +2905,7 @@
             </w:pPr>
             <w:r>
               <w:rPr>
-                <w:rFonts w:ascii="Calibri" w:hAnsi="Calibri" w:eastAsia="Microsoft YaHei"/>
+                <w:rFonts w:ascii="Microsoft YaHei" w:hAnsi="Microsoft YaHei" w:eastAsia="Microsoft YaHei"/>
                 <w:b w:val="0"/>
                 <w:color w:val="000000"/>
                 <w:sz w:val="16"/>
@@ -2874,7 +2932,7 @@
             </w:pPr>
             <w:r>
               <w:rPr>
-                <w:rFonts w:ascii="Calibri" w:hAnsi="Calibri" w:eastAsia="Microsoft YaHei"/>
+                <w:rFonts w:ascii="Microsoft YaHei" w:hAnsi="Microsoft YaHei" w:eastAsia="Microsoft YaHei"/>
                 <w:b w:val="0"/>
                 <w:color w:val="000000"/>
                 <w:sz w:val="16"/>
@@ -2901,7 +2959,7 @@
             </w:pPr>
             <w:r>
               <w:rPr>
-                <w:rFonts w:ascii="Calibri" w:hAnsi="Calibri" w:eastAsia="Microsoft YaHei"/>
+                <w:rFonts w:ascii="Microsoft YaHei" w:hAnsi="Microsoft YaHei" w:eastAsia="Microsoft YaHei"/>
                 <w:b w:val="0"/>
                 <w:color w:val="000000"/>
                 <w:sz w:val="16"/>
@@ -2928,7 +2986,7 @@
             </w:pPr>
             <w:r>
               <w:rPr>
-                <w:rFonts w:ascii="Calibri" w:hAnsi="Calibri" w:eastAsia="Microsoft YaHei"/>
+                <w:rFonts w:ascii="Microsoft YaHei" w:hAnsi="Microsoft YaHei" w:eastAsia="Microsoft YaHei"/>
                 <w:b w:val="0"/>
                 <w:color w:val="000000"/>
                 <w:sz w:val="16"/>
@@ -2955,7 +3013,7 @@
             </w:pPr>
             <w:r>
               <w:rPr>
-                <w:rFonts w:ascii="Calibri" w:hAnsi="Calibri" w:eastAsia="Microsoft YaHei"/>
+                <w:rFonts w:ascii="Microsoft YaHei" w:hAnsi="Microsoft YaHei" w:eastAsia="Microsoft YaHei"/>
                 <w:b w:val="0"/>
                 <w:color w:val="000000"/>
                 <w:sz w:val="16"/>
@@ -2982,7 +3040,7 @@
             </w:pPr>
             <w:r>
               <w:rPr>
-                <w:rFonts w:ascii="Calibri" w:hAnsi="Calibri" w:eastAsia="Microsoft YaHei"/>
+                <w:rFonts w:ascii="Microsoft YaHei" w:hAnsi="Microsoft YaHei" w:eastAsia="Microsoft YaHei"/>
                 <w:b w:val="0"/>
                 <w:color w:val="000000"/>
                 <w:sz w:val="16"/>
@@ -3009,7 +3067,7 @@
             </w:pPr>
             <w:r>
               <w:rPr>
-                <w:rFonts w:ascii="Calibri" w:hAnsi="Calibri" w:eastAsia="Microsoft YaHei"/>
+                <w:rFonts w:ascii="Microsoft YaHei" w:hAnsi="Microsoft YaHei" w:eastAsia="Microsoft YaHei"/>
                 <w:b w:val="0"/>
                 <w:color w:val="000000"/>
                 <w:sz w:val="16"/>
@@ -3067,7 +3125,7 @@
       </w:pPr>
       <w:r>
         <w:rPr>
-          <w:rFonts w:ascii="Calibri" w:hAnsi="Calibri" w:eastAsia="Microsoft YaHei"/>
+          <w:rFonts w:ascii="Microsoft YaHei" w:hAnsi="Microsoft YaHei" w:eastAsia="Microsoft YaHei"/>
           <w:i/>
           <w:color w:val="555555"/>
           <w:sz w:val="19"/>
@@ -3077,9 +3135,16 @@
     </w:p>
     <w:p>
       <w:pPr>
-        <w:pStyle w:val="Heading1"/>
+        <w:keepNext/>
+        <w:spacing w:before="320" w:after="160"/>
       </w:pPr>
       <w:r>
+        <w:rPr>
+          <w:rFonts w:ascii="Microsoft YaHei" w:hAnsi="Microsoft YaHei" w:eastAsia="Microsoft YaHei"/>
+          <w:b/>
+          <w:color w:val="2E74B5"/>
+          <w:sz w:val="32"/>
+        </w:rPr>
         <w:t>延迟与本地 GGUF 性能</w:t>
       </w:r>
     </w:p>
@@ -3089,7 +3154,7 @@
       </w:pPr>
       <w:r>
         <w:rPr>
-          <w:rFonts w:ascii="Calibri" w:hAnsi="Calibri" w:eastAsia="Microsoft YaHei"/>
+          <w:rFonts w:ascii="Microsoft YaHei" w:hAnsi="Microsoft YaHei" w:eastAsia="Microsoft YaHei"/>
         </w:rPr>
         <w:t>完整证据场景平均 3.76 秒/例，P95 为 5.51 秒；12 帧场景平均 2.56 秒/例，P95 为 3.20 秒。规则与小模型校准流水线不包含每例完整 GGUF 文本生成。</w:t>
       </w:r>
@@ -3143,7 +3208,7 @@
             </w:pPr>
             <w:r>
               <w:rPr>
-                <w:rFonts w:ascii="Calibri" w:hAnsi="Calibri" w:eastAsia="Microsoft YaHei"/>
+                <w:rFonts w:ascii="Microsoft YaHei" w:hAnsi="Microsoft YaHei" w:eastAsia="Microsoft YaHei"/>
                 <w:b/>
                 <w:color w:val="000000"/>
                 <w:sz w:val="16"/>
@@ -3171,7 +3236,7 @@
             </w:pPr>
             <w:r>
               <w:rPr>
-                <w:rFonts w:ascii="Calibri" w:hAnsi="Calibri" w:eastAsia="Microsoft YaHei"/>
+                <w:rFonts w:ascii="Microsoft YaHei" w:hAnsi="Microsoft YaHei" w:eastAsia="Microsoft YaHei"/>
                 <w:b/>
                 <w:color w:val="000000"/>
                 <w:sz w:val="16"/>
@@ -3199,7 +3264,7 @@
             </w:pPr>
             <w:r>
               <w:rPr>
-                <w:rFonts w:ascii="Calibri" w:hAnsi="Calibri" w:eastAsia="Microsoft YaHei"/>
+                <w:rFonts w:ascii="Microsoft YaHei" w:hAnsi="Microsoft YaHei" w:eastAsia="Microsoft YaHei"/>
                 <w:b/>
                 <w:color w:val="000000"/>
                 <w:sz w:val="16"/>
@@ -3227,7 +3292,7 @@
             </w:pPr>
             <w:r>
               <w:rPr>
-                <w:rFonts w:ascii="Calibri" w:hAnsi="Calibri" w:eastAsia="Microsoft YaHei"/>
+                <w:rFonts w:ascii="Microsoft YaHei" w:hAnsi="Microsoft YaHei" w:eastAsia="Microsoft YaHei"/>
                 <w:b/>
                 <w:color w:val="000000"/>
                 <w:sz w:val="16"/>
@@ -3255,7 +3320,7 @@
             </w:pPr>
             <w:r>
               <w:rPr>
-                <w:rFonts w:ascii="Calibri" w:hAnsi="Calibri" w:eastAsia="Microsoft YaHei"/>
+                <w:rFonts w:ascii="Microsoft YaHei" w:hAnsi="Microsoft YaHei" w:eastAsia="Microsoft YaHei"/>
                 <w:b/>
                 <w:color w:val="000000"/>
                 <w:sz w:val="16"/>
@@ -3283,7 +3348,7 @@
             </w:pPr>
             <w:r>
               <w:rPr>
-                <w:rFonts w:ascii="Calibri" w:hAnsi="Calibri" w:eastAsia="Microsoft YaHei"/>
+                <w:rFonts w:ascii="Microsoft YaHei" w:hAnsi="Microsoft YaHei" w:eastAsia="Microsoft YaHei"/>
                 <w:b/>
                 <w:color w:val="000000"/>
                 <w:sz w:val="16"/>
@@ -3311,7 +3376,7 @@
             </w:pPr>
             <w:r>
               <w:rPr>
-                <w:rFonts w:ascii="Calibri" w:hAnsi="Calibri" w:eastAsia="Microsoft YaHei"/>
+                <w:rFonts w:ascii="Microsoft YaHei" w:hAnsi="Microsoft YaHei" w:eastAsia="Microsoft YaHei"/>
                 <w:b/>
                 <w:color w:val="000000"/>
                 <w:sz w:val="16"/>
@@ -3339,7 +3404,7 @@
             </w:pPr>
             <w:r>
               <w:rPr>
-                <w:rFonts w:ascii="Calibri" w:hAnsi="Calibri" w:eastAsia="Microsoft YaHei"/>
+                <w:rFonts w:ascii="Microsoft YaHei" w:hAnsi="Microsoft YaHei" w:eastAsia="Microsoft YaHei"/>
                 <w:b/>
                 <w:color w:val="000000"/>
                 <w:sz w:val="16"/>
@@ -3371,7 +3436,7 @@
             </w:pPr>
             <w:r>
               <w:rPr>
-                <w:rFonts w:ascii="Calibri" w:hAnsi="Calibri" w:eastAsia="Microsoft YaHei"/>
+                <w:rFonts w:ascii="Microsoft YaHei" w:hAnsi="Microsoft YaHei" w:eastAsia="Microsoft YaHei"/>
                 <w:b w:val="0"/>
                 <w:color w:val="000000"/>
                 <w:sz w:val="16"/>
@@ -3398,7 +3463,7 @@
             </w:pPr>
             <w:r>
               <w:rPr>
-                <w:rFonts w:ascii="Calibri" w:hAnsi="Calibri" w:eastAsia="Microsoft YaHei"/>
+                <w:rFonts w:ascii="Microsoft YaHei" w:hAnsi="Microsoft YaHei" w:eastAsia="Microsoft YaHei"/>
                 <w:b w:val="0"/>
                 <w:color w:val="000000"/>
                 <w:sz w:val="16"/>
@@ -3425,7 +3490,7 @@
             </w:pPr>
             <w:r>
               <w:rPr>
-                <w:rFonts w:ascii="Calibri" w:hAnsi="Calibri" w:eastAsia="Microsoft YaHei"/>
+                <w:rFonts w:ascii="Microsoft YaHei" w:hAnsi="Microsoft YaHei" w:eastAsia="Microsoft YaHei"/>
                 <w:b w:val="0"/>
                 <w:color w:val="000000"/>
                 <w:sz w:val="16"/>
@@ -3452,7 +3517,7 @@
             </w:pPr>
             <w:r>
               <w:rPr>
-                <w:rFonts w:ascii="Calibri" w:hAnsi="Calibri" w:eastAsia="Microsoft YaHei"/>
+                <w:rFonts w:ascii="Microsoft YaHei" w:hAnsi="Microsoft YaHei" w:eastAsia="Microsoft YaHei"/>
                 <w:b w:val="0"/>
                 <w:color w:val="000000"/>
                 <w:sz w:val="16"/>
@@ -3479,7 +3544,7 @@
             </w:pPr>
             <w:r>
               <w:rPr>
-                <w:rFonts w:ascii="Calibri" w:hAnsi="Calibri" w:eastAsia="Microsoft YaHei"/>
+                <w:rFonts w:ascii="Microsoft YaHei" w:hAnsi="Microsoft YaHei" w:eastAsia="Microsoft YaHei"/>
                 <w:b w:val="0"/>
                 <w:color w:val="000000"/>
                 <w:sz w:val="16"/>
@@ -3506,7 +3571,7 @@
             </w:pPr>
             <w:r>
               <w:rPr>
-                <w:rFonts w:ascii="Calibri" w:hAnsi="Calibri" w:eastAsia="Microsoft YaHei"/>
+                <w:rFonts w:ascii="Microsoft YaHei" w:hAnsi="Microsoft YaHei" w:eastAsia="Microsoft YaHei"/>
                 <w:b w:val="0"/>
                 <w:color w:val="000000"/>
                 <w:sz w:val="16"/>
@@ -3533,7 +3598,7 @@
             </w:pPr>
             <w:r>
               <w:rPr>
-                <w:rFonts w:ascii="Calibri" w:hAnsi="Calibri" w:eastAsia="Microsoft YaHei"/>
+                <w:rFonts w:ascii="Microsoft YaHei" w:hAnsi="Microsoft YaHei" w:eastAsia="Microsoft YaHei"/>
                 <w:b w:val="0"/>
                 <w:color w:val="000000"/>
                 <w:sz w:val="16"/>
@@ -3560,7 +3625,7 @@
             </w:pPr>
             <w:r>
               <w:rPr>
-                <w:rFonts w:ascii="Calibri" w:hAnsi="Calibri" w:eastAsia="Microsoft YaHei"/>
+                <w:rFonts w:ascii="Microsoft YaHei" w:hAnsi="Microsoft YaHei" w:eastAsia="Microsoft YaHei"/>
                 <w:b w:val="0"/>
                 <w:color w:val="000000"/>
                 <w:sz w:val="16"/>
@@ -3592,7 +3657,7 @@
             </w:pPr>
             <w:r>
               <w:rPr>
-                <w:rFonts w:ascii="Calibri" w:hAnsi="Calibri" w:eastAsia="Microsoft YaHei"/>
+                <w:rFonts w:ascii="Microsoft YaHei" w:hAnsi="Microsoft YaHei" w:eastAsia="Microsoft YaHei"/>
                 <w:b w:val="0"/>
                 <w:color w:val="000000"/>
                 <w:sz w:val="16"/>
@@ -3619,7 +3684,7 @@
             </w:pPr>
             <w:r>
               <w:rPr>
-                <w:rFonts w:ascii="Calibri" w:hAnsi="Calibri" w:eastAsia="Microsoft YaHei"/>
+                <w:rFonts w:ascii="Microsoft YaHei" w:hAnsi="Microsoft YaHei" w:eastAsia="Microsoft YaHei"/>
                 <w:b w:val="0"/>
                 <w:color w:val="000000"/>
                 <w:sz w:val="16"/>
@@ -3646,7 +3711,7 @@
             </w:pPr>
             <w:r>
               <w:rPr>
-                <w:rFonts w:ascii="Calibri" w:hAnsi="Calibri" w:eastAsia="Microsoft YaHei"/>
+                <w:rFonts w:ascii="Microsoft YaHei" w:hAnsi="Microsoft YaHei" w:eastAsia="Microsoft YaHei"/>
                 <w:b w:val="0"/>
                 <w:color w:val="000000"/>
                 <w:sz w:val="16"/>
@@ -3673,7 +3738,7 @@
             </w:pPr>
             <w:r>
               <w:rPr>
-                <w:rFonts w:ascii="Calibri" w:hAnsi="Calibri" w:eastAsia="Microsoft YaHei"/>
+                <w:rFonts w:ascii="Microsoft YaHei" w:hAnsi="Microsoft YaHei" w:eastAsia="Microsoft YaHei"/>
                 <w:b w:val="0"/>
                 <w:color w:val="000000"/>
                 <w:sz w:val="16"/>
@@ -3700,7 +3765,7 @@
             </w:pPr>
             <w:r>
               <w:rPr>
-                <w:rFonts w:ascii="Calibri" w:hAnsi="Calibri" w:eastAsia="Microsoft YaHei"/>
+                <w:rFonts w:ascii="Microsoft YaHei" w:hAnsi="Microsoft YaHei" w:eastAsia="Microsoft YaHei"/>
                 <w:b w:val="0"/>
                 <w:color w:val="000000"/>
                 <w:sz w:val="16"/>
@@ -3727,7 +3792,7 @@
             </w:pPr>
             <w:r>
               <w:rPr>
-                <w:rFonts w:ascii="Calibri" w:hAnsi="Calibri" w:eastAsia="Microsoft YaHei"/>
+                <w:rFonts w:ascii="Microsoft YaHei" w:hAnsi="Microsoft YaHei" w:eastAsia="Microsoft YaHei"/>
                 <w:b w:val="0"/>
                 <w:color w:val="000000"/>
                 <w:sz w:val="16"/>
@@ -3754,7 +3819,7 @@
             </w:pPr>
             <w:r>
               <w:rPr>
-                <w:rFonts w:ascii="Calibri" w:hAnsi="Calibri" w:eastAsia="Microsoft YaHei"/>
+                <w:rFonts w:ascii="Microsoft YaHei" w:hAnsi="Microsoft YaHei" w:eastAsia="Microsoft YaHei"/>
                 <w:b w:val="0"/>
                 <w:color w:val="000000"/>
                 <w:sz w:val="16"/>
@@ -3781,7 +3846,7 @@
             </w:pPr>
             <w:r>
               <w:rPr>
-                <w:rFonts w:ascii="Calibri" w:hAnsi="Calibri" w:eastAsia="Microsoft YaHei"/>
+                <w:rFonts w:ascii="Microsoft YaHei" w:hAnsi="Microsoft YaHei" w:eastAsia="Microsoft YaHei"/>
                 <w:b w:val="0"/>
                 <w:color w:val="000000"/>
                 <w:sz w:val="16"/>
@@ -3839,7 +3904,7 @@
       </w:pPr>
       <w:r>
         <w:rPr>
-          <w:rFonts w:ascii="Calibri" w:hAnsi="Calibri" w:eastAsia="Microsoft YaHei"/>
+          <w:rFonts w:ascii="Microsoft YaHei" w:hAnsi="Microsoft YaHei" w:eastAsia="Microsoft YaHei"/>
           <w:i/>
           <w:color w:val="555555"/>
           <w:sz w:val="19"/>
@@ -3890,7 +3955,7 @@
             </w:pPr>
             <w:r>
               <w:rPr>
-                <w:rFonts w:ascii="Calibri" w:hAnsi="Calibri" w:eastAsia="Microsoft YaHei"/>
+                <w:rFonts w:ascii="Microsoft YaHei" w:hAnsi="Microsoft YaHei" w:eastAsia="Microsoft YaHei"/>
                 <w:b/>
                 <w:color w:val="000000"/>
                 <w:sz w:val="16"/>
@@ -3918,7 +3983,7 @@
             </w:pPr>
             <w:r>
               <w:rPr>
-                <w:rFonts w:ascii="Calibri" w:hAnsi="Calibri" w:eastAsia="Microsoft YaHei"/>
+                <w:rFonts w:ascii="Microsoft YaHei" w:hAnsi="Microsoft YaHei" w:eastAsia="Microsoft YaHei"/>
                 <w:b/>
                 <w:color w:val="000000"/>
                 <w:sz w:val="16"/>
@@ -3950,7 +4015,7 @@
             </w:pPr>
             <w:r>
               <w:rPr>
-                <w:rFonts w:ascii="Calibri" w:hAnsi="Calibri" w:eastAsia="Microsoft YaHei"/>
+                <w:rFonts w:ascii="Microsoft YaHei" w:hAnsi="Microsoft YaHei" w:eastAsia="Microsoft YaHei"/>
                 <w:b w:val="0"/>
                 <w:color w:val="000000"/>
                 <w:sz w:val="16"/>
@@ -3977,7 +4042,7 @@
             </w:pPr>
             <w:r>
               <w:rPr>
-                <w:rFonts w:ascii="Calibri" w:hAnsi="Calibri" w:eastAsia="Microsoft YaHei"/>
+                <w:rFonts w:ascii="Microsoft YaHei" w:hAnsi="Microsoft YaHei" w:eastAsia="Microsoft YaHei"/>
                 <w:b w:val="0"/>
                 <w:color w:val="000000"/>
                 <w:sz w:val="16"/>
@@ -4009,7 +4074,7 @@
             </w:pPr>
             <w:r>
               <w:rPr>
-                <w:rFonts w:ascii="Calibri" w:hAnsi="Calibri" w:eastAsia="Microsoft YaHei"/>
+                <w:rFonts w:ascii="Microsoft YaHei" w:hAnsi="Microsoft YaHei" w:eastAsia="Microsoft YaHei"/>
                 <w:b w:val="0"/>
                 <w:color w:val="000000"/>
                 <w:sz w:val="16"/>
@@ -4036,7 +4101,7 @@
             </w:pPr>
             <w:r>
               <w:rPr>
-                <w:rFonts w:ascii="Calibri" w:hAnsi="Calibri" w:eastAsia="Microsoft YaHei"/>
+                <w:rFonts w:ascii="Microsoft YaHei" w:hAnsi="Microsoft YaHei" w:eastAsia="Microsoft YaHei"/>
                 <w:b w:val="0"/>
                 <w:color w:val="000000"/>
                 <w:sz w:val="16"/>
@@ -4068,7 +4133,7 @@
             </w:pPr>
             <w:r>
               <w:rPr>
-                <w:rFonts w:ascii="Calibri" w:hAnsi="Calibri" w:eastAsia="Microsoft YaHei"/>
+                <w:rFonts w:ascii="Microsoft YaHei" w:hAnsi="Microsoft YaHei" w:eastAsia="Microsoft YaHei"/>
                 <w:b w:val="0"/>
                 <w:color w:val="000000"/>
                 <w:sz w:val="16"/>
@@ -4095,7 +4160,7 @@
             </w:pPr>
             <w:r>
               <w:rPr>
-                <w:rFonts w:ascii="Calibri" w:hAnsi="Calibri" w:eastAsia="Microsoft YaHei"/>
+                <w:rFonts w:ascii="Microsoft YaHei" w:hAnsi="Microsoft YaHei" w:eastAsia="Microsoft YaHei"/>
                 <w:b w:val="0"/>
                 <w:color w:val="000000"/>
                 <w:sz w:val="16"/>
@@ -4127,7 +4192,7 @@
             </w:pPr>
             <w:r>
               <w:rPr>
-                <w:rFonts w:ascii="Calibri" w:hAnsi="Calibri" w:eastAsia="Microsoft YaHei"/>
+                <w:rFonts w:ascii="Microsoft YaHei" w:hAnsi="Microsoft YaHei" w:eastAsia="Microsoft YaHei"/>
                 <w:b w:val="0"/>
                 <w:color w:val="000000"/>
                 <w:sz w:val="16"/>
@@ -4154,7 +4219,7 @@
             </w:pPr>
             <w:r>
               <w:rPr>
-                <w:rFonts w:ascii="Calibri" w:hAnsi="Calibri" w:eastAsia="Microsoft YaHei"/>
+                <w:rFonts w:ascii="Microsoft YaHei" w:hAnsi="Microsoft YaHei" w:eastAsia="Microsoft YaHei"/>
                 <w:b w:val="0"/>
                 <w:color w:val="000000"/>
                 <w:sz w:val="16"/>
@@ -4186,7 +4251,7 @@
             </w:pPr>
             <w:r>
               <w:rPr>
-                <w:rFonts w:ascii="Calibri" w:hAnsi="Calibri" w:eastAsia="Microsoft YaHei"/>
+                <w:rFonts w:ascii="Microsoft YaHei" w:hAnsi="Microsoft YaHei" w:eastAsia="Microsoft YaHei"/>
                 <w:b w:val="0"/>
                 <w:color w:val="000000"/>
                 <w:sz w:val="16"/>
@@ -4213,7 +4278,7 @@
             </w:pPr>
             <w:r>
               <w:rPr>
-                <w:rFonts w:ascii="Calibri" w:hAnsi="Calibri" w:eastAsia="Microsoft YaHei"/>
+                <w:rFonts w:ascii="Microsoft YaHei" w:hAnsi="Microsoft YaHei" w:eastAsia="Microsoft YaHei"/>
                 <w:b w:val="0"/>
                 <w:color w:val="000000"/>
                 <w:sz w:val="16"/>
@@ -4245,7 +4310,7 @@
             </w:pPr>
             <w:r>
               <w:rPr>
-                <w:rFonts w:ascii="Calibri" w:hAnsi="Calibri" w:eastAsia="Microsoft YaHei"/>
+                <w:rFonts w:ascii="Microsoft YaHei" w:hAnsi="Microsoft YaHei" w:eastAsia="Microsoft YaHei"/>
                 <w:b w:val="0"/>
                 <w:color w:val="000000"/>
                 <w:sz w:val="16"/>
@@ -4272,7 +4337,7 @@
             </w:pPr>
             <w:r>
               <w:rPr>
-                <w:rFonts w:ascii="Calibri" w:hAnsi="Calibri" w:eastAsia="Microsoft YaHei"/>
+                <w:rFonts w:ascii="Microsoft YaHei" w:hAnsi="Microsoft YaHei" w:eastAsia="Microsoft YaHei"/>
                 <w:b w:val="0"/>
                 <w:color w:val="000000"/>
                 <w:sz w:val="16"/>
@@ -4304,7 +4369,7 @@
             </w:pPr>
             <w:r>
               <w:rPr>
-                <w:rFonts w:ascii="Calibri" w:hAnsi="Calibri" w:eastAsia="Microsoft YaHei"/>
+                <w:rFonts w:ascii="Microsoft YaHei" w:hAnsi="Microsoft YaHei" w:eastAsia="Microsoft YaHei"/>
                 <w:b w:val="0"/>
                 <w:color w:val="000000"/>
                 <w:sz w:val="16"/>
@@ -4331,7 +4396,7 @@
             </w:pPr>
             <w:r>
               <w:rPr>
-                <w:rFonts w:ascii="Calibri" w:hAnsi="Calibri" w:eastAsia="Microsoft YaHei"/>
+                <w:rFonts w:ascii="Microsoft YaHei" w:hAnsi="Microsoft YaHei" w:eastAsia="Microsoft YaHei"/>
                 <w:b w:val="0"/>
                 <w:color w:val="000000"/>
                 <w:sz w:val="16"/>
@@ -4363,7 +4428,7 @@
             </w:pPr>
             <w:r>
               <w:rPr>
-                <w:rFonts w:ascii="Calibri" w:hAnsi="Calibri" w:eastAsia="Microsoft YaHei"/>
+                <w:rFonts w:ascii="Microsoft YaHei" w:hAnsi="Microsoft YaHei" w:eastAsia="Microsoft YaHei"/>
                 <w:b w:val="0"/>
                 <w:color w:val="000000"/>
                 <w:sz w:val="16"/>
@@ -4390,7 +4455,7 @@
             </w:pPr>
             <w:r>
               <w:rPr>
-                <w:rFonts w:ascii="Calibri" w:hAnsi="Calibri" w:eastAsia="Microsoft YaHei"/>
+                <w:rFonts w:ascii="Microsoft YaHei" w:hAnsi="Microsoft YaHei" w:eastAsia="Microsoft YaHei"/>
                 <w:b w:val="0"/>
                 <w:color w:val="000000"/>
                 <w:sz w:val="16"/>
@@ -4404,9 +4469,16 @@
     <w:p/>
     <w:p>
       <w:pPr>
-        <w:pStyle w:val="Heading1"/>
+        <w:keepNext/>
+        <w:spacing w:before="320" w:after="160"/>
       </w:pPr>
       <w:r>
+        <w:rPr>
+          <w:rFonts w:ascii="Microsoft YaHei" w:hAnsi="Microsoft YaHei" w:eastAsia="Microsoft YaHei"/>
+          <w:b/>
+          <w:color w:val="2E74B5"/>
+          <w:sz w:val="32"/>
+        </w:rPr>
         <w:t>数据、模型与方法</w:t>
       </w:r>
     </w:p>
@@ -4416,7 +4488,7 @@
       </w:pPr>
       <w:r>
         <w:rPr>
-          <w:rFonts w:ascii="Calibri" w:hAnsi="Calibri" w:eastAsia="Microsoft YaHei"/>
+          <w:rFonts w:ascii="Microsoft YaHei" w:hAnsi="Microsoft YaHei" w:eastAsia="Microsoft YaHei"/>
         </w:rPr>
         <w:t>本次主测试集来自授权本地 DICOM/报告时间映射，共 60 个病例。该数据只用于本地授权教育验证，不随代码发布，不作为公开数据集再分发。报告链接标签被用作当前 benchmark 的报告链接金标准，但不是独立多专家盲法复核金标准。</w:t>
       </w:r>
@@ -4427,7 +4499,7 @@
       </w:pPr>
       <w:r>
         <w:rPr>
-          <w:rFonts w:ascii="Calibri" w:hAnsi="Calibri" w:eastAsia="Microsoft YaHei"/>
+          <w:rFonts w:ascii="Microsoft YaHei" w:hAnsi="Microsoft YaHei" w:eastAsia="Microsoft YaHei"/>
         </w:rPr>
         <w:t>V5 使用 EchoNet-Dynamic 公开数据进行动态 B-mode EF 校准。实际读取 10,030 个心尖四腔 .avi 视频、FileList.csv 中的 EF/ESV/EDV/FPS/帧数/官方 split，以及 VolumeTracings.csv 中的专家左室追踪帧。EchoNet-Dynamic 原论文证明心超视频深度学习可用于逐搏心功能评估（Ouyang et al., 2020）。</w:t>
       </w:r>
@@ -4476,7 +4548,7 @@
             </w:pPr>
             <w:r>
               <w:rPr>
-                <w:rFonts w:ascii="Calibri" w:hAnsi="Calibri" w:eastAsia="Microsoft YaHei"/>
+                <w:rFonts w:ascii="Microsoft YaHei" w:hAnsi="Microsoft YaHei" w:eastAsia="Microsoft YaHei"/>
                 <w:b/>
                 <w:color w:val="000000"/>
                 <w:sz w:val="16"/>
@@ -4504,7 +4576,7 @@
             </w:pPr>
             <w:r>
               <w:rPr>
-                <w:rFonts w:ascii="Calibri" w:hAnsi="Calibri" w:eastAsia="Microsoft YaHei"/>
+                <w:rFonts w:ascii="Microsoft YaHei" w:hAnsi="Microsoft YaHei" w:eastAsia="Microsoft YaHei"/>
                 <w:b/>
                 <w:color w:val="000000"/>
                 <w:sz w:val="16"/>
@@ -4532,7 +4604,7 @@
             </w:pPr>
             <w:r>
               <w:rPr>
-                <w:rFonts w:ascii="Calibri" w:hAnsi="Calibri" w:eastAsia="Microsoft YaHei"/>
+                <w:rFonts w:ascii="Microsoft YaHei" w:hAnsi="Microsoft YaHei" w:eastAsia="Microsoft YaHei"/>
                 <w:b/>
                 <w:color w:val="000000"/>
                 <w:sz w:val="16"/>
@@ -4564,7 +4636,7 @@
             </w:pPr>
             <w:r>
               <w:rPr>
-                <w:rFonts w:ascii="Calibri" w:hAnsi="Calibri" w:eastAsia="Microsoft YaHei"/>
+                <w:rFonts w:ascii="Microsoft YaHei" w:hAnsi="Microsoft YaHei" w:eastAsia="Microsoft YaHei"/>
                 <w:b w:val="0"/>
                 <w:color w:val="000000"/>
                 <w:sz w:val="16"/>
@@ -4591,7 +4663,7 @@
             </w:pPr>
             <w:r>
               <w:rPr>
-                <w:rFonts w:ascii="Calibri" w:hAnsi="Calibri" w:eastAsia="Microsoft YaHei"/>
+                <w:rFonts w:ascii="Microsoft YaHei" w:hAnsi="Microsoft YaHei" w:eastAsia="Microsoft YaHei"/>
                 <w:b w:val="0"/>
                 <w:color w:val="000000"/>
                 <w:sz w:val="16"/>
@@ -4618,7 +4690,7 @@
             </w:pPr>
             <w:r>
               <w:rPr>
-                <w:rFonts w:ascii="Calibri" w:hAnsi="Calibri" w:eastAsia="Microsoft YaHei"/>
+                <w:rFonts w:ascii="Microsoft YaHei" w:hAnsi="Microsoft YaHei" w:eastAsia="Microsoft YaHei"/>
                 <w:b w:val="0"/>
                 <w:color w:val="000000"/>
                 <w:sz w:val="16"/>
@@ -4650,7 +4722,7 @@
             </w:pPr>
             <w:r>
               <w:rPr>
-                <w:rFonts w:ascii="Calibri" w:hAnsi="Calibri" w:eastAsia="Microsoft YaHei"/>
+                <w:rFonts w:ascii="Microsoft YaHei" w:hAnsi="Microsoft YaHei" w:eastAsia="Microsoft YaHei"/>
                 <w:b w:val="0"/>
                 <w:color w:val="000000"/>
                 <w:sz w:val="16"/>
@@ -4677,7 +4749,7 @@
             </w:pPr>
             <w:r>
               <w:rPr>
-                <w:rFonts w:ascii="Calibri" w:hAnsi="Calibri" w:eastAsia="Microsoft YaHei"/>
+                <w:rFonts w:ascii="Microsoft YaHei" w:hAnsi="Microsoft YaHei" w:eastAsia="Microsoft YaHei"/>
                 <w:b w:val="0"/>
                 <w:color w:val="000000"/>
                 <w:sz w:val="16"/>
@@ -4704,7 +4776,7 @@
             </w:pPr>
             <w:r>
               <w:rPr>
-                <w:rFonts w:ascii="Calibri" w:hAnsi="Calibri" w:eastAsia="Microsoft YaHei"/>
+                <w:rFonts w:ascii="Microsoft YaHei" w:hAnsi="Microsoft YaHei" w:eastAsia="Microsoft YaHei"/>
                 <w:b w:val="0"/>
                 <w:color w:val="000000"/>
                 <w:sz w:val="16"/>
@@ -4759,7 +4831,7 @@
             </w:pPr>
             <w:r>
               <w:rPr>
-                <w:rFonts w:ascii="Calibri" w:hAnsi="Calibri" w:eastAsia="Microsoft YaHei"/>
+                <w:rFonts w:ascii="Microsoft YaHei" w:hAnsi="Microsoft YaHei" w:eastAsia="Microsoft YaHei"/>
                 <w:b/>
                 <w:color w:val="000000"/>
                 <w:sz w:val="16"/>
@@ -4787,7 +4859,7 @@
             </w:pPr>
             <w:r>
               <w:rPr>
-                <w:rFonts w:ascii="Calibri" w:hAnsi="Calibri" w:eastAsia="Microsoft YaHei"/>
+                <w:rFonts w:ascii="Microsoft YaHei" w:hAnsi="Microsoft YaHei" w:eastAsia="Microsoft YaHei"/>
                 <w:b/>
                 <w:color w:val="000000"/>
                 <w:sz w:val="16"/>
@@ -4819,7 +4891,7 @@
             </w:pPr>
             <w:r>
               <w:rPr>
-                <w:rFonts w:ascii="Calibri" w:hAnsi="Calibri" w:eastAsia="Microsoft YaHei"/>
+                <w:rFonts w:ascii="Microsoft YaHei" w:hAnsi="Microsoft YaHei" w:eastAsia="Microsoft YaHei"/>
                 <w:b w:val="0"/>
                 <w:color w:val="000000"/>
                 <w:sz w:val="16"/>
@@ -4846,7 +4918,7 @@
             </w:pPr>
             <w:r>
               <w:rPr>
-                <w:rFonts w:ascii="Calibri" w:hAnsi="Calibri" w:eastAsia="Microsoft YaHei"/>
+                <w:rFonts w:ascii="Microsoft YaHei" w:hAnsi="Microsoft YaHei" w:eastAsia="Microsoft YaHei"/>
                 <w:b w:val="0"/>
                 <w:color w:val="000000"/>
                 <w:sz w:val="16"/>
@@ -4878,7 +4950,7 @@
             </w:pPr>
             <w:r>
               <w:rPr>
-                <w:rFonts w:ascii="Calibri" w:hAnsi="Calibri" w:eastAsia="Microsoft YaHei"/>
+                <w:rFonts w:ascii="Microsoft YaHei" w:hAnsi="Microsoft YaHei" w:eastAsia="Microsoft YaHei"/>
                 <w:b w:val="0"/>
                 <w:color w:val="000000"/>
                 <w:sz w:val="16"/>
@@ -4905,7 +4977,7 @@
             </w:pPr>
             <w:r>
               <w:rPr>
-                <w:rFonts w:ascii="Calibri" w:hAnsi="Calibri" w:eastAsia="Microsoft YaHei"/>
+                <w:rFonts w:ascii="Microsoft YaHei" w:hAnsi="Microsoft YaHei" w:eastAsia="Microsoft YaHei"/>
                 <w:b w:val="0"/>
                 <w:color w:val="000000"/>
                 <w:sz w:val="16"/>
@@ -4937,7 +5009,7 @@
             </w:pPr>
             <w:r>
               <w:rPr>
-                <w:rFonts w:ascii="Calibri" w:hAnsi="Calibri" w:eastAsia="Microsoft YaHei"/>
+                <w:rFonts w:ascii="Microsoft YaHei" w:hAnsi="Microsoft YaHei" w:eastAsia="Microsoft YaHei"/>
                 <w:b w:val="0"/>
                 <w:color w:val="000000"/>
                 <w:sz w:val="16"/>
@@ -4964,7 +5036,7 @@
             </w:pPr>
             <w:r>
               <w:rPr>
-                <w:rFonts w:ascii="Calibri" w:hAnsi="Calibri" w:eastAsia="Microsoft YaHei"/>
+                <w:rFonts w:ascii="Microsoft YaHei" w:hAnsi="Microsoft YaHei" w:eastAsia="Microsoft YaHei"/>
                 <w:b w:val="0"/>
                 <w:color w:val="000000"/>
                 <w:sz w:val="16"/>
@@ -4996,7 +5068,7 @@
             </w:pPr>
             <w:r>
               <w:rPr>
-                <w:rFonts w:ascii="Calibri" w:hAnsi="Calibri" w:eastAsia="Microsoft YaHei"/>
+                <w:rFonts w:ascii="Microsoft YaHei" w:hAnsi="Microsoft YaHei" w:eastAsia="Microsoft YaHei"/>
                 <w:b w:val="0"/>
                 <w:color w:val="000000"/>
                 <w:sz w:val="16"/>
@@ -5023,7 +5095,7 @@
             </w:pPr>
             <w:r>
               <w:rPr>
-                <w:rFonts w:ascii="Calibri" w:hAnsi="Calibri" w:eastAsia="Microsoft YaHei"/>
+                <w:rFonts w:ascii="Microsoft YaHei" w:hAnsi="Microsoft YaHei" w:eastAsia="Microsoft YaHei"/>
                 <w:b w:val="0"/>
                 <w:color w:val="000000"/>
                 <w:sz w:val="16"/>
@@ -5055,7 +5127,7 @@
             </w:pPr>
             <w:r>
               <w:rPr>
-                <w:rFonts w:ascii="Calibri" w:hAnsi="Calibri" w:eastAsia="Microsoft YaHei"/>
+                <w:rFonts w:ascii="Microsoft YaHei" w:hAnsi="Microsoft YaHei" w:eastAsia="Microsoft YaHei"/>
                 <w:b w:val="0"/>
                 <w:color w:val="000000"/>
                 <w:sz w:val="16"/>
@@ -5082,7 +5154,7 @@
             </w:pPr>
             <w:r>
               <w:rPr>
-                <w:rFonts w:ascii="Calibri" w:hAnsi="Calibri" w:eastAsia="Microsoft YaHei"/>
+                <w:rFonts w:ascii="Microsoft YaHei" w:hAnsi="Microsoft YaHei" w:eastAsia="Microsoft YaHei"/>
                 <w:b w:val="0"/>
                 <w:color w:val="000000"/>
                 <w:sz w:val="16"/>
@@ -5114,7 +5186,7 @@
             </w:pPr>
             <w:r>
               <w:rPr>
-                <w:rFonts w:ascii="Calibri" w:hAnsi="Calibri" w:eastAsia="Microsoft YaHei"/>
+                <w:rFonts w:ascii="Microsoft YaHei" w:hAnsi="Microsoft YaHei" w:eastAsia="Microsoft YaHei"/>
                 <w:b w:val="0"/>
                 <w:color w:val="000000"/>
                 <w:sz w:val="16"/>
@@ -5141,7 +5213,7 @@
             </w:pPr>
             <w:r>
               <w:rPr>
-                <w:rFonts w:ascii="Calibri" w:hAnsi="Calibri" w:eastAsia="Microsoft YaHei"/>
+                <w:rFonts w:ascii="Microsoft YaHei" w:hAnsi="Microsoft YaHei" w:eastAsia="Microsoft YaHei"/>
                 <w:b w:val="0"/>
                 <w:color w:val="000000"/>
                 <w:sz w:val="16"/>
@@ -5173,7 +5245,7 @@
             </w:pPr>
             <w:r>
               <w:rPr>
-                <w:rFonts w:ascii="Calibri" w:hAnsi="Calibri" w:eastAsia="Microsoft YaHei"/>
+                <w:rFonts w:ascii="Microsoft YaHei" w:hAnsi="Microsoft YaHei" w:eastAsia="Microsoft YaHei"/>
                 <w:b w:val="0"/>
                 <w:color w:val="000000"/>
                 <w:sz w:val="16"/>
@@ -5200,7 +5272,7 @@
             </w:pPr>
             <w:r>
               <w:rPr>
-                <w:rFonts w:ascii="Calibri" w:hAnsi="Calibri" w:eastAsia="Microsoft YaHei"/>
+                <w:rFonts w:ascii="Microsoft YaHei" w:hAnsi="Microsoft YaHei" w:eastAsia="Microsoft YaHei"/>
                 <w:b w:val="0"/>
                 <w:color w:val="000000"/>
                 <w:sz w:val="16"/>
@@ -5232,7 +5304,7 @@
             </w:pPr>
             <w:r>
               <w:rPr>
-                <w:rFonts w:ascii="Calibri" w:hAnsi="Calibri" w:eastAsia="Microsoft YaHei"/>
+                <w:rFonts w:ascii="Microsoft YaHei" w:hAnsi="Microsoft YaHei" w:eastAsia="Microsoft YaHei"/>
                 <w:b w:val="0"/>
                 <w:color w:val="000000"/>
                 <w:sz w:val="16"/>
@@ -5259,7 +5331,7 @@
             </w:pPr>
             <w:r>
               <w:rPr>
-                <w:rFonts w:ascii="Calibri" w:hAnsi="Calibri" w:eastAsia="Microsoft YaHei"/>
+                <w:rFonts w:ascii="Microsoft YaHei" w:hAnsi="Microsoft YaHei" w:eastAsia="Microsoft YaHei"/>
                 <w:b w:val="0"/>
                 <w:color w:val="000000"/>
                 <w:sz w:val="16"/>
@@ -5317,7 +5389,7 @@
       </w:pPr>
       <w:r>
         <w:rPr>
-          <w:rFonts w:ascii="Calibri" w:hAnsi="Calibri" w:eastAsia="Microsoft YaHei"/>
+          <w:rFonts w:ascii="Microsoft YaHei" w:hAnsi="Microsoft YaHei" w:eastAsia="Microsoft YaHei"/>
           <w:i/>
           <w:color w:val="555555"/>
           <w:sz w:val="19"/>
@@ -5327,9 +5399,16 @@
     </w:p>
     <w:p>
       <w:pPr>
-        <w:pStyle w:val="Heading1"/>
+        <w:keepNext/>
+        <w:spacing w:before="320" w:after="160"/>
       </w:pPr>
       <w:r>
+        <w:rPr>
+          <w:rFonts w:ascii="Microsoft YaHei" w:hAnsi="Microsoft YaHei" w:eastAsia="Microsoft YaHei"/>
+          <w:b/>
+          <w:color w:val="2E74B5"/>
+          <w:sz w:val="32"/>
+        </w:rPr>
         <w:t>Benchmark 设计与现有方案比较</w:t>
       </w:r>
     </w:p>
@@ -5339,7 +5418,7 @@
       </w:pPr>
       <w:r>
         <w:rPr>
-          <w:rFonts w:ascii="Calibri" w:hAnsi="Calibri" w:eastAsia="Microsoft YaHei"/>
+          <w:rFonts w:ascii="Microsoft YaHei" w:hAnsi="Microsoft YaHei" w:eastAsia="Microsoft YaHei"/>
         </w:rPr>
         <w:t>EchoBench v1 是项目级 benchmark，而不是单脚本 smoke test。它包含单例交互、离线批量和常驻 server 三类场景。本次主报告使用离线批量完整证据、离线批量 12 帧代表抽样和 GGUF server smoke。性能测量思路参考 MLPerf 对离线、客户端和服务端场景的拆分，但本报告不是 MLPerf 官方提交结果（MLCommons, n.d.-a, n.d.-b）。</w:t>
       </w:r>
@@ -5350,16 +5429,23 @@
       </w:pPr>
       <w:r>
         <w:rPr>
-          <w:rFonts w:ascii="Calibri" w:hAnsi="Calibri" w:eastAsia="Microsoft YaHei"/>
+          <w:rFonts w:ascii="Microsoft YaHei" w:hAnsi="Microsoft YaHei" w:eastAsia="Microsoft YaHei"/>
         </w:rPr>
         <w:t>现有公开心超 AI 方案中，EchoNet-Dynamic 聚焦 EF 与左室功能，CAMUS 聚焦 2D 心超分割（Leclerc et al., 2019; Ouyang et al., 2020）。CardioConsult V5 的差异化在于多格式输入、B-mode 与 Color Doppler 代理特征、动图兼容、层级病症输出和本地离线 Gemma4 4B GGUF 中文报告生成。</w:t>
       </w:r>
     </w:p>
     <w:p>
       <w:pPr>
-        <w:pStyle w:val="Heading1"/>
+        <w:keepNext/>
+        <w:spacing w:before="320" w:after="160"/>
       </w:pPr>
       <w:r>
+        <w:rPr>
+          <w:rFonts w:ascii="Microsoft YaHei" w:hAnsi="Microsoft YaHei" w:eastAsia="Microsoft YaHei"/>
+          <w:b/>
+          <w:color w:val="2E74B5"/>
+          <w:sz w:val="32"/>
+        </w:rPr>
         <w:t>成本模型与工程取舍</w:t>
       </w:r>
     </w:p>
@@ -5369,7 +5455,7 @@
       </w:pPr>
       <w:r>
         <w:rPr>
-          <w:rFonts w:ascii="Calibri" w:hAnsi="Calibri" w:eastAsia="Microsoft YaHei"/>
+          <w:rFonts w:ascii="Microsoft YaHei" w:hAnsi="Microsoft YaHei" w:eastAsia="Microsoft YaHei"/>
         </w:rPr>
         <w:t>V5 的成本结构主要是一次性硬件和模型文件成本，运行时不需要按病例调用云 API。完整证据场景按平均 3.76 秒/例估算，规则流水线理论吞吐约 957 例/小时；12 帧场景按平均 2.56 秒/例估算，理论吞吐约 1,405 例/小时。真实 UI 使用会受人工选文件、磁盘读取、DICOM 解码和 GGUF 文本生成影响，因此演示吞吐应按更保守数值估计。</w:t>
       </w:r>
@@ -5380,16 +5466,23 @@
       </w:pPr>
       <w:r>
         <w:rPr>
-          <w:rFonts w:ascii="Calibri" w:hAnsi="Calibri" w:eastAsia="Microsoft YaHei"/>
+          <w:rFonts w:ascii="Microsoft YaHei" w:hAnsi="Microsoft YaHei" w:eastAsia="Microsoft YaHei"/>
         </w:rPr>
-        <w:t>端到端大型视频模型可能在 EF 或分割任务上更强，但会带来 GPU/NPU 依赖、模型体积、训练时间和移动端迁移成本。V5 选择小模型校准和规则融合，是为了确保普通 PC 可跑、移动端后续可迁移，并且每条诊断都有特征证据和规则路径可追踪。</w:t>
+        <w:t>端到端大型视频模型可能在 EF 或分割任务上更强，但会带来 GPU/NPU 依赖、模型体积、训练时间和移动端迁移成本。V5 选择小模型校准和规则融合，是为了确保超声设备旁的普通 PC 可跑、移动端后续可迁移，并且每条诊断都有特征证据和规则路径可追踪。</w:t>
       </w:r>
     </w:p>
     <w:p>
       <w:pPr>
-        <w:pStyle w:val="Heading1"/>
+        <w:keepNext/>
+        <w:spacing w:before="320" w:after="160"/>
       </w:pPr>
       <w:r>
+        <w:rPr>
+          <w:rFonts w:ascii="Microsoft YaHei" w:hAnsi="Microsoft YaHei" w:eastAsia="Microsoft YaHei"/>
+          <w:b/>
+          <w:color w:val="2E74B5"/>
+          <w:sz w:val="32"/>
+        </w:rPr>
         <w:t>限制与下一步</w:t>
       </w:r>
     </w:p>
@@ -5400,7 +5493,7 @@
       </w:pPr>
       <w:r>
         <w:rPr>
-          <w:rFonts w:ascii="Calibri" w:hAnsi="Calibri" w:eastAsia="Microsoft YaHei"/>
+          <w:rFonts w:ascii="Microsoft YaHei" w:hAnsi="Microsoft YaHei" w:eastAsia="Microsoft YaHei"/>
         </w:rPr>
         <w:t>本地 60 例测试集规模有限，且来自授权本地数据，不是公开多中心盲法验证集。</w:t>
       </w:r>
@@ -5412,7 +5505,7 @@
       </w:pPr>
       <w:r>
         <w:rPr>
-          <w:rFonts w:ascii="Calibri" w:hAnsi="Calibri" w:eastAsia="Microsoft YaHei"/>
+          <w:rFonts w:ascii="Microsoft YaHei" w:hAnsi="Microsoft YaHei" w:eastAsia="Microsoft YaHei"/>
         </w:rPr>
         <w:t>报告链接标签是当前 benchmark 的金标准，但不是 2-3 位超声专家独立盲评后的共识标签。</w:t>
       </w:r>
@@ -5424,7 +5517,7 @@
       </w:pPr>
       <w:r>
         <w:rPr>
-          <w:rFonts w:ascii="Calibri" w:hAnsi="Calibri" w:eastAsia="Microsoft YaHei"/>
+          <w:rFonts w:ascii="Microsoft YaHei" w:hAnsi="Microsoft YaHei" w:eastAsia="Microsoft YaHei"/>
         </w:rPr>
         <w:t>TR 在本批数据中全为阳性，PR 和 severe 标签样本不足，不能做有效结论。</w:t>
       </w:r>
@@ -5436,7 +5529,7 @@
       </w:pPr>
       <w:r>
         <w:rPr>
-          <w:rFonts w:ascii="Calibri" w:hAnsi="Calibri" w:eastAsia="Microsoft YaHei"/>
+          <w:rFonts w:ascii="Microsoft YaHei" w:hAnsi="Microsoft YaHei" w:eastAsia="Microsoft YaHei"/>
         </w:rPr>
         <w:t>EchoNet-Dynamic 只增强 A4C B-mode 心功能相关任务，不提供瓣膜反流分级监督。</w:t>
       </w:r>
@@ -5448,7 +5541,7 @@
       </w:pPr>
       <w:r>
         <w:rPr>
-          <w:rFonts w:ascii="Calibri" w:hAnsi="Calibri" w:eastAsia="Microsoft YaHei"/>
+          <w:rFonts w:ascii="Microsoft YaHei" w:hAnsi="Microsoft YaHei" w:eastAsia="Microsoft YaHei"/>
         </w:rPr>
         <w:t>AR、RWMA 和左房扩大在 12 帧抽样下降明显，未来必须增强切面识别、动图分割和标签平衡。</w:t>
       </w:r>
@@ -5489,7 +5582,7 @@
             </w:pPr>
             <w:r>
               <w:rPr>
-                <w:rFonts w:ascii="Calibri" w:hAnsi="Calibri" w:eastAsia="Microsoft YaHei"/>
+                <w:rFonts w:ascii="Microsoft YaHei" w:hAnsi="Microsoft YaHei" w:eastAsia="Microsoft YaHei"/>
                 <w:b/>
                 <w:color w:val="1F4D78"/>
               </w:rPr>
@@ -5502,7 +5595,7 @@
             </w:pPr>
             <w:r>
               <w:rPr>
-                <w:rFonts w:ascii="Calibri" w:hAnsi="Calibri" w:eastAsia="Microsoft YaHei"/>
+                <w:rFonts w:ascii="Microsoft YaHei" w:hAnsi="Microsoft YaHei" w:eastAsia="Microsoft YaHei"/>
                 <w:sz w:val="20"/>
               </w:rPr>
               <w:t>本系统仅用于医学教学、算法演示和基层参考，不是医疗器械输出，不作为正式临床诊断、治疗建议或医嘱。若患者存在胸痛、晕厥、明显呼吸困难、低血压、发绀或急性心衰表现，应直接进入正式医疗流程并由有资质医师复核。</w:t>
@@ -5514,9 +5607,16 @@
     <w:p/>
     <w:p>
       <w:pPr>
-        <w:pStyle w:val="Heading1"/>
+        <w:keepNext/>
+        <w:spacing w:before="320" w:after="160"/>
       </w:pPr>
       <w:r>
+        <w:rPr>
+          <w:rFonts w:ascii="Microsoft YaHei" w:hAnsi="Microsoft YaHei" w:eastAsia="Microsoft YaHei"/>
+          <w:b/>
+          <w:color w:val="2E74B5"/>
+          <w:sz w:val="32"/>
+        </w:rPr>
         <w:t>可复现信息</w:t>
       </w:r>
     </w:p>
@@ -5563,7 +5663,7 @@
             </w:pPr>
             <w:r>
               <w:rPr>
-                <w:rFonts w:ascii="Calibri" w:hAnsi="Calibri" w:eastAsia="Microsoft YaHei"/>
+                <w:rFonts w:ascii="Microsoft YaHei" w:hAnsi="Microsoft YaHei" w:eastAsia="Microsoft YaHei"/>
                 <w:b/>
                 <w:color w:val="000000"/>
                 <w:sz w:val="16"/>
@@ -5591,7 +5691,7 @@
             </w:pPr>
             <w:r>
               <w:rPr>
-                <w:rFonts w:ascii="Calibri" w:hAnsi="Calibri" w:eastAsia="Microsoft YaHei"/>
+                <w:rFonts w:ascii="Microsoft YaHei" w:hAnsi="Microsoft YaHei" w:eastAsia="Microsoft YaHei"/>
                 <w:b/>
                 <w:color w:val="000000"/>
                 <w:sz w:val="16"/>
@@ -5623,7 +5723,7 @@
             </w:pPr>
             <w:r>
               <w:rPr>
-                <w:rFonts w:ascii="Calibri" w:hAnsi="Calibri" w:eastAsia="Microsoft YaHei"/>
+                <w:rFonts w:ascii="Microsoft YaHei" w:hAnsi="Microsoft YaHei" w:eastAsia="Microsoft YaHei"/>
                 <w:b w:val="0"/>
                 <w:color w:val="000000"/>
                 <w:sz w:val="16"/>
@@ -5650,7 +5750,7 @@
             </w:pPr>
             <w:r>
               <w:rPr>
-                <w:rFonts w:ascii="Calibri" w:hAnsi="Calibri" w:eastAsia="Microsoft YaHei"/>
+                <w:rFonts w:ascii="Microsoft YaHei" w:hAnsi="Microsoft YaHei" w:eastAsia="Microsoft YaHei"/>
                 <w:b w:val="0"/>
                 <w:color w:val="000000"/>
                 <w:sz w:val="16"/>
@@ -5682,7 +5782,7 @@
             </w:pPr>
             <w:r>
               <w:rPr>
-                <w:rFonts w:ascii="Calibri" w:hAnsi="Calibri" w:eastAsia="Microsoft YaHei"/>
+                <w:rFonts w:ascii="Microsoft YaHei" w:hAnsi="Microsoft YaHei" w:eastAsia="Microsoft YaHei"/>
                 <w:b w:val="0"/>
                 <w:color w:val="000000"/>
                 <w:sz w:val="16"/>
@@ -5709,7 +5809,7 @@
             </w:pPr>
             <w:r>
               <w:rPr>
-                <w:rFonts w:ascii="Calibri" w:hAnsi="Calibri" w:eastAsia="Microsoft YaHei"/>
+                <w:rFonts w:ascii="Microsoft YaHei" w:hAnsi="Microsoft YaHei" w:eastAsia="Microsoft YaHei"/>
                 <w:b w:val="0"/>
                 <w:color w:val="000000"/>
                 <w:sz w:val="16"/>
@@ -5741,7 +5841,7 @@
             </w:pPr>
             <w:r>
               <w:rPr>
-                <w:rFonts w:ascii="Calibri" w:hAnsi="Calibri" w:eastAsia="Microsoft YaHei"/>
+                <w:rFonts w:ascii="Microsoft YaHei" w:hAnsi="Microsoft YaHei" w:eastAsia="Microsoft YaHei"/>
                 <w:b w:val="0"/>
                 <w:color w:val="000000"/>
                 <w:sz w:val="16"/>
@@ -5768,7 +5868,7 @@
             </w:pPr>
             <w:r>
               <w:rPr>
-                <w:rFonts w:ascii="Calibri" w:hAnsi="Calibri" w:eastAsia="Microsoft YaHei"/>
+                <w:rFonts w:ascii="Microsoft YaHei" w:hAnsi="Microsoft YaHei" w:eastAsia="Microsoft YaHei"/>
                 <w:b w:val="0"/>
                 <w:color w:val="000000"/>
                 <w:sz w:val="16"/>
@@ -5800,7 +5900,7 @@
             </w:pPr>
             <w:r>
               <w:rPr>
-                <w:rFonts w:ascii="Calibri" w:hAnsi="Calibri" w:eastAsia="Microsoft YaHei"/>
+                <w:rFonts w:ascii="Microsoft YaHei" w:hAnsi="Microsoft YaHei" w:eastAsia="Microsoft YaHei"/>
                 <w:b w:val="0"/>
                 <w:color w:val="000000"/>
                 <w:sz w:val="16"/>
@@ -5827,7 +5927,7 @@
             </w:pPr>
             <w:r>
               <w:rPr>
-                <w:rFonts w:ascii="Calibri" w:hAnsi="Calibri" w:eastAsia="Microsoft YaHei"/>
+                <w:rFonts w:ascii="Microsoft YaHei" w:hAnsi="Microsoft YaHei" w:eastAsia="Microsoft YaHei"/>
                 <w:b w:val="0"/>
                 <w:color w:val="000000"/>
                 <w:sz w:val="16"/>
@@ -5859,7 +5959,7 @@
             </w:pPr>
             <w:r>
               <w:rPr>
-                <w:rFonts w:ascii="Calibri" w:hAnsi="Calibri" w:eastAsia="Microsoft YaHei"/>
+                <w:rFonts w:ascii="Microsoft YaHei" w:hAnsi="Microsoft YaHei" w:eastAsia="Microsoft YaHei"/>
                 <w:b w:val="0"/>
                 <w:color w:val="000000"/>
                 <w:sz w:val="16"/>
@@ -5886,7 +5986,7 @@
             </w:pPr>
             <w:r>
               <w:rPr>
-                <w:rFonts w:ascii="Calibri" w:hAnsi="Calibri" w:eastAsia="Microsoft YaHei"/>
+                <w:rFonts w:ascii="Microsoft YaHei" w:hAnsi="Microsoft YaHei" w:eastAsia="Microsoft YaHei"/>
                 <w:b w:val="0"/>
                 <w:color w:val="000000"/>
                 <w:sz w:val="16"/>
@@ -5918,7 +6018,7 @@
             </w:pPr>
             <w:r>
               <w:rPr>
-                <w:rFonts w:ascii="Calibri" w:hAnsi="Calibri" w:eastAsia="Microsoft YaHei"/>
+                <w:rFonts w:ascii="Microsoft YaHei" w:hAnsi="Microsoft YaHei" w:eastAsia="Microsoft YaHei"/>
                 <w:b w:val="0"/>
                 <w:color w:val="000000"/>
                 <w:sz w:val="16"/>
@@ -5945,7 +6045,7 @@
             </w:pPr>
             <w:r>
               <w:rPr>
-                <w:rFonts w:ascii="Calibri" w:hAnsi="Calibri" w:eastAsia="Microsoft YaHei"/>
+                <w:rFonts w:ascii="Microsoft YaHei" w:hAnsi="Microsoft YaHei" w:eastAsia="Microsoft YaHei"/>
                 <w:b w:val="0"/>
                 <w:color w:val="000000"/>
                 <w:sz w:val="16"/>
@@ -5959,9 +6059,16 @@
     <w:p/>
     <w:p>
       <w:pPr>
-        <w:pStyle w:val="Heading1"/>
+        <w:keepNext/>
+        <w:spacing w:before="320" w:after="160"/>
       </w:pPr>
       <w:r>
+        <w:rPr>
+          <w:rFonts w:ascii="Microsoft YaHei" w:hAnsi="Microsoft YaHei" w:eastAsia="Microsoft YaHei"/>
+          <w:b/>
+          <w:color w:val="2E74B5"/>
+          <w:sz w:val="32"/>
+        </w:rPr>
         <w:t>参考文献</w:t>
       </w:r>
     </w:p>
@@ -5972,7 +6079,7 @@
       </w:pPr>
       <w:r>
         <w:rPr>
-          <w:rFonts w:ascii="Calibri" w:hAnsi="Calibri" w:eastAsia="Microsoft YaHei"/>
+          <w:rFonts w:ascii="Microsoft YaHei" w:hAnsi="Microsoft YaHei" w:eastAsia="Microsoft YaHei"/>
           <w:sz w:val="18"/>
         </w:rPr>
         <w:t>FDA, Health Canada, &amp; Medicines and Healthcare products Regulatory Agency. (2021). Good machine learning practice for medical device development: Guiding principles. https://www.gov.uk/government/publications/good-machine-learning-practice-for-medical-device-development-guiding-principles</w:t>
@@ -5985,7 +6092,7 @@
       </w:pPr>
       <w:r>
         <w:rPr>
-          <w:rFonts w:ascii="Calibri" w:hAnsi="Calibri" w:eastAsia="Microsoft YaHei"/>
+          <w:rFonts w:ascii="Microsoft YaHei" w:hAnsi="Microsoft YaHei" w:eastAsia="Microsoft YaHei"/>
           <w:sz w:val="18"/>
         </w:rPr>
         <w:t>ggml-org. (n.d.). GGUF file format - llama.cpp. Retrieved June 4, 2026, from https://www.mintlify.com/ggml-org/llama.cpp/concepts/gguf-format</w:t>
@@ -5998,7 +6105,7 @@
       </w:pPr>
       <w:r>
         <w:rPr>
-          <w:rFonts w:ascii="Calibri" w:hAnsi="Calibri" w:eastAsia="Microsoft YaHei"/>
+          <w:rFonts w:ascii="Microsoft YaHei" w:hAnsi="Microsoft YaHei" w:eastAsia="Microsoft YaHei"/>
           <w:sz w:val="18"/>
         </w:rPr>
         <w:t>Google AI for Developers. (n.d.). Get started with Gemma models. Retrieved June 4, 2026, from https://ai.google.dev/gemma/docs/get_started</w:t>
@@ -6011,7 +6118,7 @@
       </w:pPr>
       <w:r>
         <w:rPr>
-          <w:rFonts w:ascii="Calibri" w:hAnsi="Calibri" w:eastAsia="Microsoft YaHei"/>
+          <w:rFonts w:ascii="Microsoft YaHei" w:hAnsi="Microsoft YaHei" w:eastAsia="Microsoft YaHei"/>
           <w:sz w:val="18"/>
         </w:rPr>
         <w:t>Lang, R. M., Badano, L. P., Mor-Avi, V., Afilalo, J., Armstrong, A., Ernande, L., Flachskampf, F. A., Foster, E., Goldstein, S. A., Kuznetsova, T., Lancellotti, P., Muraru, D., Picard, M. H., Rietzschel, E. R., Rudski, L., Spencer, K. T., Tsang, W., &amp; Voigt, J.-U. (2015). Recommendations for cardiac chamber quantification by echocardiography in adults: An update from the American Society of Echocardiography and the European Association of Cardiovascular Imaging. Journal of the American Society of Echocardiography, 28(1), 1-39.e14. https://doi.org/10.1016/j.echo.2014.10.003</w:t>
@@ -6024,7 +6131,7 @@
       </w:pPr>
       <w:r>
         <w:rPr>
-          <w:rFonts w:ascii="Calibri" w:hAnsi="Calibri" w:eastAsia="Microsoft YaHei"/>
+          <w:rFonts w:ascii="Microsoft YaHei" w:hAnsi="Microsoft YaHei" w:eastAsia="Microsoft YaHei"/>
           <w:sz w:val="18"/>
         </w:rPr>
         <w:t>Leclerc, S., Smistad, E., Pedrosa, J., Ostvik, A., Cervenansky, F., Espinosa, F., Espeland, T., Berg, E. A. R., Jodoin, P.-M., Grenier, T., Lartizien, C., Dhooge, J., Lovstakken, L., Bernard, O., &amp; Grenier, T. (2019). Deep learning for segmentation using an open large-scale dataset in 2D echocardiography. IEEE Transactions on Medical Imaging, 38(9), 2198-2210. https://doi.org/10.1109/TMI.2019.2900516</w:t>
@@ -6037,7 +6144,7 @@
       </w:pPr>
       <w:r>
         <w:rPr>
-          <w:rFonts w:ascii="Calibri" w:hAnsi="Calibri" w:eastAsia="Microsoft YaHei"/>
+          <w:rFonts w:ascii="Microsoft YaHei" w:hAnsi="Microsoft YaHei" w:eastAsia="Microsoft YaHei"/>
           <w:sz w:val="18"/>
         </w:rPr>
         <w:t>MLCommons. (n.d.-a). MLPerf Client. Retrieved June 4, 2026, from https://mlcommons.org/benchmarks/client/</w:t>
@@ -6050,7 +6157,7 @@
       </w:pPr>
       <w:r>
         <w:rPr>
-          <w:rFonts w:ascii="Calibri" w:hAnsi="Calibri" w:eastAsia="Microsoft YaHei"/>
+          <w:rFonts w:ascii="Microsoft YaHei" w:hAnsi="Microsoft YaHei" w:eastAsia="Microsoft YaHei"/>
           <w:sz w:val="18"/>
         </w:rPr>
         <w:t>MLCommons. (n.d.-b). MLPerf Inference benchmarks. Retrieved June 4, 2026, from https://docs.mlcommons.org/inference/</w:t>
@@ -6063,7 +6170,7 @@
       </w:pPr>
       <w:r>
         <w:rPr>
-          <w:rFonts w:ascii="Calibri" w:hAnsi="Calibri" w:eastAsia="Microsoft YaHei"/>
+          <w:rFonts w:ascii="Microsoft YaHei" w:hAnsi="Microsoft YaHei" w:eastAsia="Microsoft YaHei"/>
           <w:sz w:val="18"/>
         </w:rPr>
         <w:t>MLCommons. (n.d.-c). MedPerf: An open benchmarking platform for medical artificial intelligence using federated evaluation. Retrieved June 4, 2026, from https://github.com/mlcommons/medperf</w:t>
@@ -6076,7 +6183,7 @@
       </w:pPr>
       <w:r>
         <w:rPr>
-          <w:rFonts w:ascii="Calibri" w:hAnsi="Calibri" w:eastAsia="Microsoft YaHei"/>
+          <w:rFonts w:ascii="Microsoft YaHei" w:hAnsi="Microsoft YaHei" w:eastAsia="Microsoft YaHei"/>
           <w:sz w:val="18"/>
         </w:rPr>
         <w:t>OpenAI. (2025). Introducing HealthBench. https://openai.com/index/healthbench/</w:t>
@@ -6089,7 +6196,7 @@
       </w:pPr>
       <w:r>
         <w:rPr>
-          <w:rFonts w:ascii="Calibri" w:hAnsi="Calibri" w:eastAsia="Microsoft YaHei"/>
+          <w:rFonts w:ascii="Microsoft YaHei" w:hAnsi="Microsoft YaHei" w:eastAsia="Microsoft YaHei"/>
           <w:sz w:val="18"/>
         </w:rPr>
         <w:t>Ouyang, D., He, B., Ghorbani, A., Yuan, N., Ebinger, J., Langlotz, C. P., Heidenreich, P. A., Harrington, R. A., Liang, D. H., Ashley, E. A., &amp; Zou, J. Y. (2020). Video-based AI for beat-to-beat assessment of cardiac function. Nature, 580(7802), 252-256. https://doi.org/10.1038/s41586-020-2145-8</w:t>
@@ -6102,7 +6209,7 @@
       </w:pPr>
       <w:r>
         <w:rPr>
-          <w:rFonts w:ascii="Calibri" w:hAnsi="Calibri" w:eastAsia="Microsoft YaHei"/>
+          <w:rFonts w:ascii="Microsoft YaHei" w:hAnsi="Microsoft YaHei" w:eastAsia="Microsoft YaHei"/>
           <w:sz w:val="18"/>
         </w:rPr>
         <w:t>Zoghbi, W. A., Adams, D., Bonow, R. O., Enriquez-Sarano, M., Foster, E., Grayburn, P. A., Hahn, R. T., Han, Y., Hung, J., Lang, R. M., Little, S. H., Shah, D. J., Shernan, S., Thavendiranathan, P., Thomas, J. D., &amp; Weissman, N. J. (2017). Recommendations for noninvasive evaluation of native valvular regurgitation: A report from the American Society of Echocardiography developed in collaboration with the Society for Cardiovascular Magnetic Resonance. Journal of the American Society of Echocardiography, 30(4), 303-371. https://doi.org/10.1016/j.echo.2017.01.007</w:t>
@@ -6129,7 +6236,7 @@
     </w:pPr>
     <w:r>
       <w:rPr>
-        <w:rFonts w:ascii="Calibri" w:hAnsi="Calibri" w:eastAsia="Microsoft YaHei"/>
+        <w:rFonts w:ascii="Microsoft YaHei" w:hAnsi="Microsoft YaHei" w:eastAsia="Microsoft YaHei"/>
         <w:color w:val="666666"/>
         <w:sz w:val="17"/>
       </w:rPr>
@@ -6148,7 +6255,7 @@
     </w:pPr>
     <w:r>
       <w:rPr>
-        <w:rFonts w:ascii="Calibri" w:hAnsi="Calibri" w:eastAsia="Microsoft YaHei"/>
+        <w:rFonts w:ascii="Microsoft YaHei" w:hAnsi="Microsoft YaHei" w:eastAsia="Microsoft YaHei"/>
         <w:color w:val="666666"/>
         <w:sz w:val="18"/>
       </w:rPr>
@@ -6525,7 +6632,7 @@
       <w:spacing w:after="120" w:line="264" w:lineRule="auto"/>
     </w:pPr>
     <w:rPr>
-      <w:rFonts w:ascii="Calibri" w:hAnsi="Calibri" w:eastAsia="Microsoft YaHei"/>
+      <w:rFonts w:ascii="Microsoft YaHei" w:hAnsi="Microsoft YaHei" w:eastAsia="Microsoft YaHei"/>
       <w:sz w:val="22"/>
     </w:rPr>
   </w:style>
@@ -6588,7 +6695,7 @@
       <w:outlineLvl w:val="0"/>
     </w:pPr>
     <w:rPr>
-      <w:rFonts w:asciiTheme="majorHAnsi" w:eastAsiaTheme="majorEastAsia" w:hAnsiTheme="majorHAnsi" w:cstheme="majorBidi" w:ascii="Calibri" w:hAnsi="Calibri" w:eastAsia="Microsoft YaHei"/>
+      <w:rFonts w:asciiTheme="majorHAnsi" w:eastAsiaTheme="majorEastAsia" w:hAnsiTheme="majorHAnsi" w:cstheme="majorBidi" w:ascii="Microsoft YaHei" w:hAnsi="Microsoft YaHei" w:eastAsia="Microsoft YaHei"/>
       <w:b/>
       <w:bCs/>
       <w:color w:val="2E74B5"/>
@@ -6612,7 +6719,7 @@
       <w:outlineLvl w:val="1"/>
     </w:pPr>
     <w:rPr>
-      <w:rFonts w:asciiTheme="majorHAnsi" w:eastAsiaTheme="majorEastAsia" w:hAnsiTheme="majorHAnsi" w:cstheme="majorBidi" w:ascii="Calibri" w:hAnsi="Calibri" w:eastAsia="Microsoft YaHei"/>
+      <w:rFonts w:asciiTheme="majorHAnsi" w:eastAsiaTheme="majorEastAsia" w:hAnsiTheme="majorHAnsi" w:cstheme="majorBidi" w:ascii="Microsoft YaHei" w:hAnsi="Microsoft YaHei" w:eastAsia="Microsoft YaHei"/>
       <w:b/>
       <w:bCs/>
       <w:color w:val="2E74B5"/>
@@ -6636,7 +6743,7 @@
       <w:outlineLvl w:val="2"/>
     </w:pPr>
     <w:rPr>
-      <w:rFonts w:asciiTheme="majorHAnsi" w:eastAsiaTheme="majorEastAsia" w:hAnsiTheme="majorHAnsi" w:cstheme="majorBidi" w:ascii="Calibri" w:hAnsi="Calibri" w:eastAsia="Microsoft YaHei"/>
+      <w:rFonts w:asciiTheme="majorHAnsi" w:eastAsiaTheme="majorEastAsia" w:hAnsiTheme="majorHAnsi" w:cstheme="majorBidi" w:ascii="Microsoft YaHei" w:hAnsi="Microsoft YaHei" w:eastAsia="Microsoft YaHei"/>
       <w:b/>
       <w:bCs/>
       <w:color w:val="1F4D78"/>

</xml_diff>

<commit_message>
feat: add offline multi-agent audit chain
</commit_message>
<xml_diff>
--- a/docs/v5_benchmark/CardioConsult_PC_V5_EchoBench_Technical_Report_APA_20260604.docx
+++ b/docs/v5_benchmark/CardioConsult_PC_V5_EchoBench_Technical_Report_APA_20260604.docx
@@ -82,7 +82,7 @@
                 <w:rFonts w:ascii="Microsoft YaHei" w:hAnsi="Microsoft YaHei" w:eastAsia="Microsoft YaHei"/>
                 <w:sz w:val="20"/>
               </w:rPr>
-              <w:t>CardioConsult PC V5 面向心脏超声教学参考和基层辅助初筛场景。这里的 PC 被定义为可直接接入超声机器或超声工作站的离线分析设备：它可以通过 USB、局域网共享目录、DICOM 工作站导出目录或无线超声软件导出文件读取 PNG、DICOM/DCOM 与超声动图，并在本机输出从大方向到最小病症的结构化疑似诊断文字。V5 在原有 B-mode、Color Doppler、层级标签规则和 Gemma4 4B GGUF 本地报告生成基础上，加入 EchoNet-Dynamic 动态 B-mode 校准层，用于增强 EF 和左室收缩功能减低识别。</w:t>
+              <w:t>CardioConsult PC V5 面向心脏超声教学参考和基层辅助初筛场景。这里的 PC 被定义为可直接接入超声机器或超声工作站的离线分析设备：它可以通过 USB、局域网共享目录、DICOM 工作站导出目录或无线超声软件导出文件读取 PNG、DICOM/DCOM 与超声动图，并在本机输出从大方向到最小病症的结构化疑似诊断文字。V5 在原有 B-mode、Color Doppler、层级标签规则和 Gemma4 4B GGUF 本地报告生成基础上，加入 EchoNet-Dynamic 动态 B-mode 校准层和轻量离线多智能体编排，用于增强 EF/左室收缩功能减低识别、报告安全审计和提交演示透明度。</w:t>
             </w:r>
           </w:p>
         </w:tc>
@@ -4504,6 +4504,17 @@
         <w:t>V5 使用 EchoNet-Dynamic 公开数据进行动态 B-mode EF 校准。实际读取 10,030 个心尖四腔 .avi 视频、FileList.csv 中的 EF/ESV/EDV/FPS/帧数/官方 split，以及 VolumeTracings.csv 中的专家左室追踪帧。EchoNet-Dynamic 原论文证明心超视频深度学习可用于逐搏心功能评估（Ouyang et al., 2020）。</w:t>
       </w:r>
     </w:p>
+    <w:p>
+      <w:pPr>
+        <w:spacing w:after="120" w:line="264" w:lineRule="auto"/>
+      </w:pPr>
+      <w:r>
+        <w:rPr>
+          <w:rFonts w:ascii="Microsoft YaHei" w:hAnsi="Microsoft YaHei" w:eastAsia="Microsoft YaHei"/>
+        </w:rPr>
+        <w:t>V5 新增轻量离线多智能体编排：InputAgent 核对输入和相位，FeatureAgent 汇总 B-mode/Doppler/动态图代理特征，DiagnosisAgent 复用层级规则、V4 校准和 V5 EchoNet 校准，ReportAgent 记录规则后备或本地 Gemma4 后端，SafetyAuditAgent 检查教学用途、非医疗器械、非临床诊断和复核/转诊提示。该层不联网、不额外多次调用 Gemma4，也不重复执行图像特征提取；当前本机 rule-only smoke test 中，开启审计 JSON 写入后的诊断阶段平均约 4.1 ms/次，单次自检审计链显示约 8.6 ms，并可把审计 JSON 写入 exports/agent_audit/。</w:t>
+      </w:r>
+    </w:p>
     <w:tbl>
       <w:tblPr>
         <w:tblW w:type="auto" w:w="0"/>

</xml_diff>

<commit_message>
polish submission runtime audit and reports
</commit_message>
<xml_diff>
--- a/docs/v5_benchmark/CardioConsult_PC_V5_EchoBench_Technical_Report_APA_20260604.docx
+++ b/docs/v5_benchmark/CardioConsult_PC_V5_EchoBench_Technical_Report_APA_20260604.docx
@@ -81,7 +81,7 @@
           <w:rFonts w:ascii="Microsoft YaHei" w:hAnsi="Microsoft YaHei" w:eastAsia="Microsoft YaHei"/>
           <w:sz w:val="20"/>
         </w:rPr>
-        <w:t>冻结前检查显示，当前仓库可以完成三类任务：第一，规则路径 `app.py --self-test-rule-only` 通过，输出包含 `教学参考病症判断：`、`最小病症：`、`逻辑链：` 和安全边界；第二，授权本地 60 例 EchoBench 完整证据场景 60/60 成功，平均 1.418 秒/例，MR F1=0.964、AR F1=0.700、低 EF F1=0.857；第三，12 帧代表输入场景 60/60 成功，warm-cache 平均 0.711 秒/例，MR F1=0.936、AR F1=0.326、低 EF F1=0.615。本地 `llama-server` 项目链路第 1 例服务模式诊断耗时 37.701 秒，报告保护层记录 `Gemma4 4B offline server: http://127.0.0.1:8088 (report guard used local teaching template)`，最终输出 `has_prompt_leakage=false`。</w:t>
+        <w:t>冻结前检查显示，当前仓库可以完成三类任务：第一，规则路径 `app.py --self-test-rule-only` 通过，输出包含 `教学参考病症判断：`、`最小病症：`、`逻辑链：` 和安全边界；第二，授权本地 60 例 EchoBench 完整证据场景 60/60 成功，平均 1.418 秒/例，MR F1=0.964、AR F1=0.700、低 EF F1=0.857；第三，12 帧代表输入场景 60/60 成功，warm-cache 平均 0.711 秒/例，MR F1=0.936、AR F1=0.326、低 EF F1=0.615。本地 `llama-server` 项目链路第 1 例服务模式诊断耗时 69.168 秒，报告保护层记录 `Gemma4 4B offline server: http://127.0.0.1:8088 (Gemma4 output received; report guard repaired required fields)`，最终输出 `has_prompt_leakage=false`、`report_source=gemma4_repaired`。</w:t>
       </w:r>
     </w:p>
     <w:p>
@@ -6526,7 +6526,7 @@
           <w:rFonts w:ascii="Microsoft YaHei" w:hAnsi="Microsoft YaHei" w:eastAsia="Microsoft YaHei"/>
           <w:sz w:val="20"/>
         </w:rPr>
-        <w:t>本地服务 smoke 连续两次 `/completion` 均返回 OK：第一次 1.037 秒，第二次 0.402 秒。第二次请求 prompt tok/s 从 6.89 提升到 24.25，说明常驻模型复用有效。</w:t>
+        <w:t>本地服务 smoke 连续两次 `/completion` 均返回 OK：第一次 1.327 秒，第二次 0.522 秒。第二次请求 prompt tok/s 从 6.22 提升到 16.44，说明常驻模型复用有效。</w:t>
       </w:r>
     </w:p>
     <w:p>
@@ -6592,7 +6592,7 @@
           <w:rFonts w:ascii="Microsoft YaHei" w:hAnsi="Microsoft YaHei" w:eastAsia="Microsoft YaHei"/>
           <w:sz w:val="20"/>
         </w:rPr>
-        <w:t>项目级服务链路使用 EchoBench 第 1 例、12 个文件、`max_tokens=240`：文件加载 0.902 秒，特征提取 0.011 秒，Gemma4 服务诊断 37.701 秒；报告保护层启用，最终 `has_prompt_leakage=false`，并保留医学安全边界。</w:t>
+        <w:t>项目级服务链路使用 EchoBench 第 1 例、12 个文件、`max_tokens=240`：文件加载 0.902 秒，特征提取 0.011 秒，Gemma4 服务诊断 69.168 秒；报告保护层启用，最终 `has_prompt_leakage=false`、`report_source=gemma4_repaired`，并保留医学安全边界。</w:t>
       </w:r>
     </w:p>
     <w:p>
@@ -7501,7 +7501,7 @@
                 <w:color w:val="000000"/>
                 <w:sz w:val="16"/>
               </w:rPr>
-              <w:t>validation_speedopt/server_smoke_general_20260604.json</w:t>
+              <w:t>validation_speedopt/server_smoke_general_current_20260604.json</w:t>
             </w:r>
           </w:p>
         </w:tc>
@@ -7557,7 +7557,7 @@
                 <w:color w:val="000000"/>
                 <w:sz w:val="16"/>
               </w:rPr>
-              <w:t>validation_speedopt/server_pipeline_case1_240tok_20260604.json</w:t>
+              <w:t>validation_speedopt/server_pipeline_case1_current_20260604.json</w:t>
             </w:r>
           </w:p>
         </w:tc>
@@ -7649,7 +7649,7 @@
         <w:br/>
         <w:t>.\.venv\Scripts\python.exe tools\run_echobench_v1.py --mapping &lt;mapping.csv&gt; --out-root validation_speedopt\freeze_runs --case-limit 60 --max-files-per-case 12</w:t>
         <w:br/>
-        <w:t>.\.venv\Scripts\python.exe tools\benchmark_server_smoke.py --url http://127.0.0.1:8088 --out validation_speedopt\server_smoke_general_20260604.json</w:t>
+        <w:t>.\.venv\Scripts\python.exe tools\benchmark_server_smoke.py --url http://127.0.0.1:8088 --out validation_speedopt\server_smoke_general_current_20260604.json</w:t>
       </w:r>
     </w:p>
     <w:p>

</xml_diff>

<commit_message>
add structured gemma4 report contract
</commit_message>
<xml_diff>
--- a/docs/v5_benchmark/CardioConsult_PC_V5_EchoBench_Technical_Report_APA_20260604.docx
+++ b/docs/v5_benchmark/CardioConsult_PC_V5_EchoBench_Technical_Report_APA_20260604.docx
@@ -4,7 +4,7 @@
   <w:body>
     <w:p>
       <w:pPr>
-        <w:pStyle w:val="Heading1"/>
+        <w:spacing w:before="240" w:after="160"/>
       </w:pPr>
       <w:r>
         <w:rPr>
@@ -25,7 +25,7 @@
           <w:rFonts w:ascii="Microsoft YaHei" w:hAnsi="Microsoft YaHei" w:eastAsia="Microsoft YaHei"/>
           <w:sz w:val="20"/>
         </w:rPr>
-        <w:t>生成日期：2026-06-04</w:t>
+        <w:t>生成日期：2026-06-05</w:t>
       </w:r>
     </w:p>
     <w:p>
@@ -54,9 +54,15 @@
     </w:p>
     <w:p>
       <w:pPr>
-        <w:pStyle w:val="Heading2"/>
+        <w:spacing w:before="240" w:after="120"/>
       </w:pPr>
       <w:r>
+        <w:rPr>
+          <w:rFonts w:ascii="Microsoft YaHei" w:hAnsi="Microsoft YaHei" w:eastAsia="Microsoft YaHei"/>
+          <w:b/>
+          <w:color w:val="0F172A"/>
+          <w:sz w:val="27"/>
+        </w:rPr>
         <w:t>摘要</w:t>
       </w:r>
     </w:p>
@@ -69,7 +75,7 @@
           <w:rFonts w:ascii="Microsoft YaHei" w:hAnsi="Microsoft YaHei" w:eastAsia="Microsoft YaHei"/>
           <w:sz w:val="20"/>
         </w:rPr>
-        <w:t>CardioConsult PC V5 解决的问题是：在缺少心脏超声专科医生、网络条件有限或需要保护教学/脱敏病例数据的场景中，如何让超声初学者和基层医疗点从 PNG、DICOM/DCOM、cine/视频等文件中获得一份可解释、可审计、不会冒充正式诊断的心脏超声教学参考结果。系统把 PC 定义为接在超声机器、无线超声软件、DICOM 工作站或局域网导出目录旁的离线分析终端；所有图像预处理、特征提取、层级标签、轻量多智能体审计和 Gemma4 4B GGUF 文本生成都在本机完成。</w:t>
+        <w:t>CardioConsult PC V5 解决的问题是：在缺少心脏超声专科医生、网络条件有限或需要保护教学/脱敏病例数据的场景中，如何让超声初学者和基层医疗点从 PNG、DICOM/DCOM、cine/视频等文件中获得一份可解释、可审计、不会冒充正式诊断的心脏超声教学参考结果。系统把 PC 定义为接在超声机器、无线超声软件、DICOM 工作站或局域网导出目录旁的离线分析终端；所有图像预处理、特征提取、层级标签、Doppler 瓣膜定位评分、轻量多智能体审计和 Gemma4 4B GGUF 结构化报告生成都在本机完成。</w:t>
       </w:r>
     </w:p>
     <w:p>
@@ -81,7 +87,7 @@
           <w:rFonts w:ascii="Microsoft YaHei" w:hAnsi="Microsoft YaHei" w:eastAsia="Microsoft YaHei"/>
           <w:sz w:val="20"/>
         </w:rPr>
-        <w:t>冻结前检查显示，当前仓库可以完成三类任务：第一，规则路径 `app.py --self-test-rule-only` 通过，输出包含 `教学参考病症判断：`、`最小病症：`、`逻辑链：` 和安全边界；第二，授权本地 60 例 EchoBench 完整证据场景 60/60 成功，平均 1.418 秒/例，MR F1=0.964、AR F1=0.700、低 EF F1=0.857；第三，12 帧代表输入场景 60/60 成功，warm-cache 平均 0.711 秒/例，MR F1=0.936、AR F1=0.326、低 EF F1=0.615。本地 `llama-server` 项目链路第 1 例服务模式诊断耗时 69.168 秒，报告保护层记录 `Gemma4 4B offline server: http://127.0.0.1:8088 (Gemma4 output received; report guard repaired required fields)`，最终输出 `has_prompt_leakage=false`、`report_source=gemma4_repaired`。</w:t>
+        <w:t>冻结前检查显示，当前仓库可以完成三类任务：第一，规则路径 `app.py --self-test-rule-only` 通过，输出包含 `教学参考病症判断：`、`最小病症：`、`逻辑链：` 和安全边界；第二，授权本地 60 例 EchoBench 完整证据场景 60/60 成功，平均 1.418 秒/例，MR F1=0.964、AR F1=0.700、低 EF F1=0.857；第三，12 帧代表输入场景 60/60 成功，warm-cache 平均 0.711 秒/例，MR F1=0.936、AR F1=0.326、低 EF F1=0.615。本地 `llama-server` 项目链路第 1 例服务模式诊断耗时 69.168 秒，报告保护层记录 `Gemma4 4B offline server: http://127.0.0.1:8088 (Gemma4 output received; report guard repaired required fields)`，最终输出 `has_prompt_leakage=false`、`report_source=gemma4_repaired`；当前默认提示词进一步新增 `gemma4_structured` JSON 渲染路径。</w:t>
       </w:r>
     </w:p>
     <w:p>
@@ -98,9 +104,15 @@
     </w:p>
     <w:p>
       <w:pPr>
-        <w:pStyle w:val="Heading2"/>
+        <w:spacing w:before="240" w:after="120"/>
       </w:pPr>
       <w:r>
+        <w:rPr>
+          <w:rFonts w:ascii="Microsoft YaHei" w:hAnsi="Microsoft YaHei" w:eastAsia="Microsoft YaHei"/>
+          <w:b/>
+          <w:color w:val="0F172A"/>
+          <w:sz w:val="27"/>
+        </w:rPr>
         <w:t>1. 问题陈述与用户价值</w:t>
       </w:r>
     </w:p>
@@ -130,9 +142,15 @@
     </w:p>
     <w:p>
       <w:pPr>
-        <w:pStyle w:val="Heading2"/>
+        <w:spacing w:before="240" w:after="120"/>
       </w:pPr>
       <w:r>
+        <w:rPr>
+          <w:rFonts w:ascii="Microsoft YaHei" w:hAnsi="Microsoft YaHei" w:eastAsia="Microsoft YaHei"/>
+          <w:b/>
+          <w:color w:val="0F172A"/>
+          <w:sz w:val="27"/>
+        </w:rPr>
         <w:t>2. 系统方案</w:t>
       </w:r>
     </w:p>
@@ -145,7 +163,7 @@
           <w:rFonts w:ascii="Microsoft YaHei" w:hAnsi="Microsoft YaHei" w:eastAsia="Microsoft YaHei"/>
           <w:sz w:val="20"/>
         </w:rPr>
-        <w:t>系统分为五层：输入层读取 PNG/JPG、DICOM/DCOM、多帧 TIFF、GIF、MP4/MOV/AVI 等文件；B-mode 分支计算 SRAD/CLAHE 风格预处理、边缘密度、纹理熵、散斑残差、腔室面积代理和收缩舒张差；Color Doppler 分支将 HSV 血流颜色转为活跃区、连通域、喷流宽度、方向一致性、湍流和涡量代理；校准层用 V4 shared-EK/coupled-EK 与 V5 EchoNet-Dynamic 校准增强 EF / 左室收缩功能减低；报告层用规则或 Gemma4 4B GGUF 生成中文教学摘要，并由报告保护层清除提示词泄漏、截断和 AI 口吻。</w:t>
+        <w:t>系统分为五层：输入层读取 PNG/JPG、DICOM/DCOM、多帧 TIFF、GIF、MP4/MOV/AVI 等文件；B-mode 分支计算 SRAD/CLAHE 风格预处理、边缘密度、纹理熵、散斑残差、腔室面积代理和收缩舒张差；Color Doppler 分支将 HSV 血流颜色转为活跃区、连通域、喷流宽度、方向一致性、湍流、涡量代理和 MR/TR/AR/PR 瓣膜定位评分；校准层用 V4 shared-EK/coupled-EK 与 V5 EchoNet-Dynamic 校准增强 EF / 左室收缩功能减低；报告层默认要求 Gemma4 4B GGUF 输出 JSON object，再由报告保护层按本地诊断合同重渲染为中文教学摘要，并清除提示词泄漏、截断和 AI 口吻。</w:t>
       </w:r>
     </w:p>
     <w:p>
@@ -162,9 +180,15 @@
     </w:p>
     <w:p>
       <w:pPr>
-        <w:pStyle w:val="Heading2"/>
+        <w:spacing w:before="240" w:after="120"/>
       </w:pPr>
       <w:r>
+        <w:rPr>
+          <w:rFonts w:ascii="Microsoft YaHei" w:hAnsi="Microsoft YaHei" w:eastAsia="Microsoft YaHei"/>
+          <w:b/>
+          <w:color w:val="0F172A"/>
+          <w:sz w:val="27"/>
+        </w:rPr>
         <w:t>3. Benchmark 设计</w:t>
       </w:r>
     </w:p>
@@ -242,17 +266,29 @@
     </w:p>
     <w:p>
       <w:pPr>
-        <w:pStyle w:val="Heading2"/>
+        <w:spacing w:before="240" w:after="120"/>
       </w:pPr>
       <w:r>
+        <w:rPr>
+          <w:rFonts w:ascii="Microsoft YaHei" w:hAnsi="Microsoft YaHei" w:eastAsia="Microsoft YaHei"/>
+          <w:b/>
+          <w:color w:val="0F172A"/>
+          <w:sz w:val="27"/>
+        </w:rPr>
         <w:t>4. 主要性能结果</w:t>
       </w:r>
     </w:p>
     <w:p>
       <w:pPr>
-        <w:pStyle w:val="Heading3"/>
+        <w:spacing w:before="160" w:after="100"/>
       </w:pPr>
       <w:r>
+        <w:rPr>
+          <w:rFonts w:ascii="Microsoft YaHei" w:hAnsi="Microsoft YaHei" w:eastAsia="Microsoft YaHei"/>
+          <w:b/>
+          <w:color w:val="475569"/>
+          <w:sz w:val="22"/>
+        </w:rPr>
         <w:t>4.1 完整证据：标签性能</w:t>
       </w:r>
     </w:p>
@@ -2769,9 +2805,15 @@
     </w:p>
     <w:p>
       <w:pPr>
-        <w:pStyle w:val="Heading3"/>
+        <w:spacing w:before="160" w:after="100"/>
       </w:pPr>
       <w:r>
+        <w:rPr>
+          <w:rFonts w:ascii="Microsoft YaHei" w:hAnsi="Microsoft YaHei" w:eastAsia="Microsoft YaHei"/>
+          <w:b/>
+          <w:color w:val="475569"/>
+          <w:sz w:val="22"/>
+        </w:rPr>
         <w:t>4.2 12 帧输入：现场演示上限</w:t>
       </w:r>
     </w:p>
@@ -5330,9 +5372,15 @@
     </w:p>
     <w:p>
       <w:pPr>
-        <w:pStyle w:val="Heading3"/>
+        <w:spacing w:before="160" w:after="100"/>
       </w:pPr>
       <w:r>
+        <w:rPr>
+          <w:rFonts w:ascii="Microsoft YaHei" w:hAnsi="Microsoft YaHei" w:eastAsia="Microsoft YaHei"/>
+          <w:b/>
+          <w:color w:val="475569"/>
+          <w:sz w:val="22"/>
+        </w:rPr>
         <w:t>4.3 延迟、缓存和本地服务</w:t>
       </w:r>
     </w:p>
@@ -6592,14 +6640,20 @@
           <w:rFonts w:ascii="Microsoft YaHei" w:hAnsi="Microsoft YaHei" w:eastAsia="Microsoft YaHei"/>
           <w:sz w:val="20"/>
         </w:rPr>
-        <w:t>项目级服务链路使用 EchoBench 第 1 例、12 个文件、`max_tokens=240`：文件加载 0.902 秒，特征提取 0.011 秒，Gemma4 服务诊断 69.168 秒；报告保护层启用，最终 `has_prompt_leakage=false`、`report_source=gemma4_repaired`，并保留医学安全边界。</w:t>
+        <w:t>项目级服务链路使用 EchoBench 第 1 例、12 个文件、`max_tokens=240`：文件加载 0.902 秒，特征提取 0.011 秒，Gemma4 服务诊断 69.168 秒；报告保护层启用，最终 `has_prompt_leakage=false`、`report_source=gemma4_repaired`，并保留医学安全边界。该服务证据来自结构化 JSON 默认启用前的旧服务复现；当前代码默认新增 `structured_llm_output=true`，下一次模型服务复现可记录 `report_source=gemma4_structured`。</w:t>
       </w:r>
     </w:p>
     <w:p>
       <w:pPr>
-        <w:pStyle w:val="Heading3"/>
+        <w:spacing w:before="160" w:after="100"/>
       </w:pPr>
       <w:r>
+        <w:rPr>
+          <w:rFonts w:ascii="Microsoft YaHei" w:hAnsi="Microsoft YaHei" w:eastAsia="Microsoft YaHei"/>
+          <w:b/>
+          <w:color w:val="475569"/>
+          <w:sz w:val="22"/>
+        </w:rPr>
         <w:t>4.4 EchoNet-Dynamic 校准层</w:t>
       </w:r>
     </w:p>
@@ -6671,9 +6725,15 @@
     </w:p>
     <w:p>
       <w:pPr>
-        <w:pStyle w:val="Heading2"/>
+        <w:spacing w:before="240" w:after="120"/>
       </w:pPr>
       <w:r>
+        <w:rPr>
+          <w:rFonts w:ascii="Microsoft YaHei" w:hAnsi="Microsoft YaHei" w:eastAsia="Microsoft YaHei"/>
+          <w:b/>
+          <w:color w:val="0F172A"/>
+          <w:sz w:val="27"/>
+        </w:rPr>
         <w:t>5. 数据来源与证据覆盖</w:t>
       </w:r>
     </w:p>
@@ -6745,9 +6805,15 @@
     </w:p>
     <w:p>
       <w:pPr>
-        <w:pStyle w:val="Heading2"/>
+        <w:spacing w:before="240" w:after="120"/>
       </w:pPr>
       <w:r>
+        <w:rPr>
+          <w:rFonts w:ascii="Microsoft YaHei" w:hAnsi="Microsoft YaHei" w:eastAsia="Microsoft YaHei"/>
+          <w:b/>
+          <w:color w:val="0F172A"/>
+          <w:sz w:val="27"/>
+        </w:rPr>
         <w:t>6. 与现有方案的比较</w:t>
       </w:r>
     </w:p>
@@ -6772,14 +6838,20 @@
           <w:rFonts w:ascii="Microsoft YaHei" w:hAnsi="Microsoft YaHei" w:eastAsia="Microsoft YaHei"/>
           <w:sz w:val="20"/>
         </w:rPr>
-        <w:t>CardioConsult V5 的差异化是：输入侧兼容真实超声导出文件；算法侧融合 B-mode、Color Doppler、动图差分和 EchoNet 校准；输出侧强制最小病症、逻辑链和安全边界；运行侧采用本地规则、小模型与 GGUF LLM，边际调用成本接近 0。代价是部分细粒度病症在缺切面时准确率下降，需要明确补扫和复核。</w:t>
+        <w:t>CardioConsult V5 的差异化是：输入侧兼容真实超声导出文件；算法侧融合 B-mode、Color Doppler、Doppler 瓣膜定位评分、动图差分和 EchoNet 校准；输出侧强制最小病症、逻辑链和安全边界，并用 JSON 合同限制 Gemma4 自由漂移；运行侧采用本地规则、小模型与 GGUF LLM，边际调用成本接近 0。代价是部分细粒度病症在缺切面时准确率下降，需要明确补扫和复核。</w:t>
       </w:r>
     </w:p>
     <w:p>
       <w:pPr>
-        <w:pStyle w:val="Heading2"/>
+        <w:spacing w:before="240" w:after="120"/>
       </w:pPr>
       <w:r>
+        <w:rPr>
+          <w:rFonts w:ascii="Microsoft YaHei" w:hAnsi="Microsoft YaHei" w:eastAsia="Microsoft YaHei"/>
+          <w:b/>
+          <w:color w:val="0F172A"/>
+          <w:sz w:val="27"/>
+        </w:rPr>
         <w:t>7. 成本模型与取舍</w:t>
       </w:r>
     </w:p>
@@ -6911,9 +6983,15 @@
     </w:p>
     <w:p>
       <w:pPr>
-        <w:pStyle w:val="Heading2"/>
+        <w:spacing w:before="240" w:after="120"/>
       </w:pPr>
       <w:r>
+        <w:rPr>
+          <w:rFonts w:ascii="Microsoft YaHei" w:hAnsi="Microsoft YaHei" w:eastAsia="Microsoft YaHei"/>
+          <w:b/>
+          <w:color w:val="0F172A"/>
+          <w:sz w:val="27"/>
+        </w:rPr>
         <w:t>8. 冻结前补救与评审风险</w:t>
       </w:r>
     </w:p>
@@ -7075,9 +7153,15 @@
     </w:p>
     <w:p>
       <w:pPr>
-        <w:pStyle w:val="Heading2"/>
+        <w:spacing w:before="240" w:after="120"/>
       </w:pPr>
       <w:r>
+        <w:rPr>
+          <w:rFonts w:ascii="Microsoft YaHei" w:hAnsi="Microsoft YaHei" w:eastAsia="Microsoft YaHei"/>
+          <w:b/>
+          <w:color w:val="0F172A"/>
+          <w:sz w:val="27"/>
+        </w:rPr>
         <w:t>9. 下一步</w:t>
       </w:r>
     </w:p>
@@ -7143,9 +7227,15 @@
     </w:p>
     <w:p>
       <w:pPr>
-        <w:pStyle w:val="Heading2"/>
+        <w:spacing w:before="240" w:after="120"/>
       </w:pPr>
       <w:r>
+        <w:rPr>
+          <w:rFonts w:ascii="Microsoft YaHei" w:hAnsi="Microsoft YaHei" w:eastAsia="Microsoft YaHei"/>
+          <w:b/>
+          <w:color w:val="0F172A"/>
+          <w:sz w:val="27"/>
+        </w:rPr>
         <w:t>10. 可复现信息</w:t>
       </w:r>
     </w:p>
@@ -7654,9 +7744,15 @@
     </w:p>
     <w:p>
       <w:pPr>
-        <w:pStyle w:val="Heading2"/>
+        <w:spacing w:before="240" w:after="120"/>
       </w:pPr>
       <w:r>
+        <w:rPr>
+          <w:rFonts w:ascii="Microsoft YaHei" w:hAnsi="Microsoft YaHei" w:eastAsia="Microsoft YaHei"/>
+          <w:b/>
+          <w:color w:val="0F172A"/>
+          <w:sz w:val="27"/>
+        </w:rPr>
         <w:t>参考文献</w:t>
       </w:r>
     </w:p>

</xml_diff>

<commit_message>
clarify TR metric bias in report
</commit_message>
<xml_diff>
--- a/docs/v5_benchmark/CardioConsult_PC_V5_EchoBench_Technical_Report_APA_20260604.docx
+++ b/docs/v5_benchmark/CardioConsult_PC_V5_EchoBench_Technical_Report_APA_20260604.docx
@@ -124,7 +124,7 @@
           <w:rFonts w:ascii="Microsoft YaHei" w:hAnsi="Microsoft YaHei" w:eastAsia="Microsoft YaHei"/>
           <w:sz w:val="21"/>
         </w:rPr>
-        <w:t>冻结前检查显示，当前仓库可以完成三类任务：第一，规则路径 `app.py --self-test-rule-only` 通过，输出包含 `教学参考病症判断：`、`最小病症：`、`逻辑链：` 和安全边界；第二，授权本地 60 例 EchoBench 完整证据场景 60/60 成功，平均 1.418 秒/例，MR F1=0.964、AR F1=0.700、低 EF F1=0.857；第三，12 帧代表输入场景 60/60 成功，warm-cache 平均 0.711 秒/例，MR F1=0.936、AR F1=0.326、低 EF F1=0.615。本地 `llama-server` 项目链路第 1 例服务模式诊断耗时 69.168 秒，报告保护层记录 `Gemma4 4B offline server: http://127.0.0.1:8088 (Gemma4 output received; report guard repaired required fields)`，最终输出 `has_prompt_leakage=false`、`report_source=gemma4_repaired`；当前默认提示词进一步新增 `gemma4_structured` JSON 渲染路径。</w:t>
+        <w:t>冻结前检查显示，当前仓库可以完成三类任务：第一，规则路径 `app.py --self-test-rule-only` 通过，输出包含 `教学参考病症判断：`、`最小病症：`、`逻辑链：` 和安全边界；第二，授权本地 60 例 EchoBench 完整证据场景 60/60 成功，平均 1.418 秒/例，MR F1=0.964、AR F1=0.700、低 EF F1=0.857；第三，12 帧代表输入场景 60/60 成功，warm-cache 平均 0.711 秒/例，MR F1=0.936、AR F1=0.326、低 EF F1=0.615。需要特别说明的是，TR 在本批 60 例中全部为阳性，表格中的 1.000 只代表本批同质阳性样本内召回/一致性，不能当作真实世界泛化准确率、特异性或阴性排除能力。本地 `llama-server` 项目链路第 1 例服务模式诊断耗时 69.168 秒，报告保护层记录 `Gemma4 4B offline server: http://127.0.0.1:8088 (Gemma4 output received; report guard repaired required fields)`，最终输出 `has_prompt_leakage=false`、`report_source=gemma4_repaired`；当前默认提示词进一步新增 `gemma4_structured` JSON 渲染路径。</w:t>
       </w:r>
     </w:p>
     <w:p>
@@ -458,7 +458,7 @@
           <w:rFonts w:ascii="Microsoft YaHei" w:hAnsi="Microsoft YaHei" w:eastAsia="Microsoft YaHei"/>
           <w:sz w:val="21"/>
         </w:rPr>
-        <w:t>完整证据场景 60/60 例成功，平均 1.418 秒/例，P95=2.499 秒。MR、TR、低 EF 表现稳定；AR 中等；RWMA、心动过缓等标签因为样本少或未接入 ECG/完整报告结构化字段，不能过度宣称。</w:t>
+        <w:t>完整证据场景 60/60 例成功，平均 1.418 秒/例，P95=2.499 秒。MR、低 EF 表现稳定；AR 中等；RWMA、心动过缓等标签因为样本少或未接入 ECG/完整报告结构化字段，不能过度宣称。TR 虽在表中显示 1.000，但本批 60 例全部带 TR 阳性标签，缺少阴性样本，因此这不是严格意义上的泛化性能估计。</w:t>
       </w:r>
     </w:p>
     <w:p>
@@ -1176,7 +1176,7 @@
                 <w:color w:val="000000"/>
                 <w:sz w:val="14"/>
               </w:rPr>
-              <w:t>三尖瓣反流 TR</w:t>
+              <w:t>三尖瓣反流 TR*</w:t>
             </w:r>
           </w:p>
         </w:tc>
@@ -2957,7 +2957,7 @@
           <w:rFonts w:ascii="Microsoft YaHei" w:hAnsi="Microsoft YaHei" w:eastAsia="Microsoft YaHei"/>
           <w:sz w:val="21"/>
         </w:rPr>
-        <w:t>注：TR 在本批 60 例中全部为阳性，因此特异性没有统计解释价值。</w:t>
+        <w:t>注：TR 在本批 60 例中全部为阳性，因此 TN=0、FP=0，特异性和阴性排除能力没有统计解释价值；TR F1=1.000 只能解释为本批同质阳性样本内召回一致，不能作为“真实准确率 100%”宣传。</w:t>
       </w:r>
     </w:p>
     <w:p>
@@ -2983,7 +2983,7 @@
           <w:rFonts w:ascii="Microsoft YaHei" w:hAnsi="Microsoft YaHei" w:eastAsia="Microsoft YaHei"/>
           <w:sz w:val="21"/>
         </w:rPr>
-        <w:t>12 帧代表输入场景 60/60 例成功，warm-cache 平均 0.711 秒/例，P95=0.763 秒。MR F1 仍为 0.936，低 EF F1 为 0.615；AR F1 降至 0.326，提示主动脉瓣反流需要更完整的 A5C/主动脉瓣相关切面和彩色多普勒序列。</w:t>
+        <w:t>12 帧代表输入场景 60/60 例成功，warm-cache 平均 0.711 秒/例，P95=0.763 秒。MR F1 仍为 0.936，低 EF F1 为 0.615；AR F1 降至 0.326，提示主动脉瓣反流需要更完整的 A5C/主动脉瓣相关切面和彩色多普勒序列。TR 在 12 帧输入中同样全阳性，仍只能作为“这批 TR 阳性病例没有漏报”的证据，而不能评价对正常/无 TR 病例的区分能力。</w:t>
       </w:r>
     </w:p>
     <w:p>
@@ -3701,7 +3701,7 @@
                 <w:color w:val="000000"/>
                 <w:sz w:val="14"/>
               </w:rPr>
-              <w:t>三尖瓣反流 TR</w:t>
+              <w:t>三尖瓣反流 TR*</w:t>
             </w:r>
           </w:p>
         </w:tc>
@@ -5473,6 +5473,18 @@
       </w:tr>
     </w:tbl>
     <w:p/>
+    <w:p>
+      <w:pPr>
+        <w:spacing w:after="100" w:line="264" w:lineRule="auto"/>
+      </w:pPr>
+      <w:r>
+        <w:rPr>
+          <w:rFonts w:ascii="Microsoft YaHei" w:hAnsi="Microsoft YaHei" w:eastAsia="Microsoft YaHei"/>
+          <w:sz w:val="21"/>
+        </w:rPr>
+        <w:t>注：12 帧 TR 结果同样受全阳性标签分布影响。后续需要引入明确无 TR 的阴性病例、不同机器/不同导出格式和更宽的严重程度分布，才能报告可靠的 TR 特异性、AUC 或校准曲线。</w:t>
+      </w:r>
+    </w:p>
     <w:p>
       <w:pPr>
         <w:jc w:val="center"/>
@@ -7281,7 +7293,7 @@
           <w:rFonts w:ascii="Microsoft YaHei" w:hAnsi="Microsoft YaHei" w:eastAsia="Microsoft YaHei"/>
           <w:sz w:val="19"/>
         </w:rPr>
-        <w:t>TR 全阳性导致特异性不可解释；PR、severe、HCM 等标签样本不足。</w:t>
+        <w:t>TR 全阳性导致特异性、AUC 和真实阴性排除能力不可解释；PR、severe、HCM 等标签样本不足。</w:t>
       </w:r>
     </w:p>
     <w:p>

</xml_diff>